<commit_message>
docs: reestructurar seccion 3.7 con trazabilidad estricta de 5 pasos y marcos para pantallazos
</commit_message>
<xml_diff>
--- a/Contexto de la problematica/01_Bases_y_Requisitos_Docente/Ing software/informe_tecnico_etapa2_sgr-v4_actualizado.docx
+++ b/Contexto de la problematica/01_Bases_y_Requisitos_Docente/Ing software/informe_tecnico_etapa2_sgr-v4_actualizado.docx
@@ -17459,41 +17459,138 @@
     </w:p>
     <w:p>
       <w:pPr>
-        <w:spacing w:line="276" w:lineRule="auto" w:before="0" w:after="120"/>
+        <w:spacing w:line="276" w:lineRule="auto" w:after="120" w:before="0"/>
         <w:jc w:val="both"/>
       </w:pPr>
       <w:r>
         <w:rPr>
           <w:rFonts w:ascii="Arial" w:hAnsi="Arial"/>
+          <w:b/>
           <w:color w:val="1E293B"/>
           <w:sz w:val="22"/>
         </w:rPr>
-        <w:t>Para dar cumplimiento estricto al estándar de calidad exigido en la Guía de Formulación de Proyecto de Ingeniería de Software (TI2043), a continuación se presenta la cadena de trazabilidad bidireccional completa:</w:t>
-        <w:br/>
-        <w:t>Requerimiento Funcional (RF) ➜ Épica ➜ Caso de Uso Alto Nivel ➜ Caso de Uso Específico ➜ WireFrame (Front-End)</w:t>
+        <w:t xml:space="preserve">Cadena de Trazabilidad Estricta de Interfaces: </w:t>
+      </w:r>
+      <w:r>
+        <w:rPr>
+          <w:rFonts w:ascii="Arial" w:hAnsi="Arial"/>
+          <w:color w:val="334155"/>
+          <w:sz w:val="22"/>
+        </w:rPr>
+        <w:t>Para dar cumplimiento riguroso a la pauta de evaluación de la asignatura, el diseño y desarrollo de las interfaces del Sistema de Gestión de Resultados (SGR) se estructuró bajo una cadena estricta de trazabilidad técnica bidireccional:</w:t>
         <w:br/>
         <w:br/>
-        <w:t>Se desarrollan los dos flujos troncales del Sistema de Gestión de Resultados (SGR):</w:t>
+        <w:t>Requerimiento Funcional (RF) ➜ Épica del Backlog ➜ Caso de Uso de Alto Nivel ➜ Caso de Uso Específico ➜ Wireframe (Front-End)</w:t>
         <w:br/>
-        <w:t>• Flujo A: Formulario Unificado de Gestiones con Derivación al Tubo de Trabajo (RF-016 / CU-01.2).</w:t>
         <w:br/>
-        <w:t>• Flujo B: Tablero Kanban del Tubo de Trabajo para Seguimiento Intersectorial (RF-017 / CU-02.1).</w:t>
+        <w:t>Este estándar garantiza que ninguna pantalla sea arbitraria ni quede desconectada del modelo conceptual: cada elemento visual del Front-End responde directamente a un caso de uso detallado, a una épica planificada y a un requerimiento funcional validado con el municipio. A continuación, se desarrollan los tres flujos operacionales más trascendentes del sistema:</w:t>
       </w:r>
     </w:p>
     <w:p>
       <w:pPr>
         <w:pStyle w:val="Heading3"/>
-        <w:spacing w:before="200" w:after="60"/>
-        <w:jc w:val="left"/>
+        <w:spacing w:before="240" w:after="80"/>
       </w:pPr>
       <w:r>
         <w:rPr>
           <w:rFonts w:ascii="Arial" w:hAnsi="Arial"/>
           <w:b/>
+          <w:color w:val="1E293B"/>
+          <w:sz w:val="22"/>
+        </w:rPr>
+        <w:t>3.7.1 Flujo Operativo 1: Captura Unificada de Gestiones y Derivación al Tubo de Trabajo</w:t>
+      </w:r>
+    </w:p>
+    <w:p>
+      <w:pPr>
+        <w:spacing w:line="276" w:lineRule="auto" w:after="120" w:before="0"/>
+        <w:jc w:val="both"/>
+      </w:pPr>
+      <w:r>
+        <w:rPr>
+          <w:rFonts w:ascii="Arial" w:hAnsi="Arial"/>
+          <w:b/>
+          <w:color w:val="1E293B"/>
+          <w:sz w:val="22"/>
+        </w:rPr>
+        <w:t xml:space="preserve">1. Requerimiento Funcional (RF): </w:t>
+      </w:r>
+      <w:r>
+        <w:rPr>
+          <w:rFonts w:ascii="Arial" w:hAnsi="Arial"/>
           <w:color w:val="334155"/>
           <w:sz w:val="22"/>
         </w:rPr>
-        <w:t>3.7.1 Flujo A: Formulario Unificado de Gestiones y Derivación al Tubo</w:t>
+        <w:t>RF-016: Registro Centralizado de Gestiones Comunales y Derivación Opcional al Tubo de Trabajo (Asociado a RF03 y RF06). El sistema debe proveer una interfaz unificada que permita al operador o funcionario registrar cualquier atención ciudadana, solicitud comunitaria o caso social, autogenerando folios correlativos (GES-XXXXX / SOC-XXXXX), integrando catálogos en cascada (Tipo de Atención ➜ Subatención) y habilitando un mecanismo reactivo para derivar la solicitud al método de seguimiento del Tubo de Trabajo con fecha comprometida y área de apoyo.</w:t>
+      </w:r>
+    </w:p>
+    <w:p>
+      <w:pPr>
+        <w:spacing w:line="276" w:lineRule="auto" w:after="120" w:before="0"/>
+        <w:jc w:val="both"/>
+      </w:pPr>
+      <w:r>
+        <w:rPr>
+          <w:rFonts w:ascii="Arial" w:hAnsi="Arial"/>
+          <w:b/>
+          <w:color w:val="1E293B"/>
+          <w:sz w:val="22"/>
+        </w:rPr>
+        <w:t xml:space="preserve">2. Épica del Backlog: </w:t>
+      </w:r>
+      <w:r>
+        <w:rPr>
+          <w:rFonts w:ascii="Arial" w:hAnsi="Arial"/>
+          <w:color w:val="334155"/>
+          <w:sz w:val="22"/>
+        </w:rPr>
+        <w:t>EP-01: Gestión Centralizada de Demandas Ciudadanas y Derivación Intersectorial. Resuelve la dispersión operativa unificando los antiguos módulos dispersos (Atención Ciudadana, Gestiones Diarias y Gestor Social) en un único libro de vida municipal.</w:t>
+      </w:r>
+    </w:p>
+    <w:p>
+      <w:pPr>
+        <w:spacing w:line="276" w:lineRule="auto" w:after="120" w:before="0"/>
+        <w:jc w:val="both"/>
+      </w:pPr>
+      <w:r>
+        <w:rPr>
+          <w:rFonts w:ascii="Arial" w:hAnsi="Arial"/>
+          <w:b/>
+          <w:color w:val="1E293B"/>
+          <w:sz w:val="22"/>
+        </w:rPr>
+        <w:t xml:space="preserve">3. Caso de Uso de Alto Nivel: </w:t>
+      </w:r>
+      <w:r>
+        <w:rPr>
+          <w:rFonts w:ascii="Arial" w:hAnsi="Arial"/>
+          <w:color w:val="334155"/>
+          <w:sz w:val="22"/>
+        </w:rPr>
+        <w:t>CU-01: Administrar Gestiones Ciudadanas y Territoriales. Permite a los funcionarios y delegados territoriales crear, categorizar, filtrar y derivar solicitudes vecinales hacia las distintas áreas del municipio.</w:t>
+      </w:r>
+    </w:p>
+    <w:p>
+      <w:pPr>
+        <w:spacing w:line="276" w:lineRule="auto" w:after="120" w:before="0"/>
+        <w:jc w:val="both"/>
+      </w:pPr>
+      <w:r>
+        <w:rPr>
+          <w:rFonts w:ascii="Arial" w:hAnsi="Arial"/>
+          <w:b/>
+          <w:color w:val="1E293B"/>
+          <w:sz w:val="22"/>
+        </w:rPr>
+        <w:t xml:space="preserve">4. Caso de Uso Específico: </w:t>
+      </w:r>
+      <w:r>
+        <w:rPr>
+          <w:rFonts w:ascii="Arial" w:hAnsi="Arial"/>
+          <w:color w:val="334155"/>
+          <w:sz w:val="22"/>
+        </w:rPr>
+        <w:t>CU-01.2: Registrar Nueva Gestión con Activación de Tubo de Trabajo. A continuación se presenta el Cuadro Descriptivo Normalizado que rige la interacción técnica y el comportamiento del formulario:</w:t>
       </w:r>
     </w:p>
     <w:tbl>
@@ -17501,6 +17598,14 @@
         <w:tblW w:type="auto" w:w="0"/>
         <w:jc w:val="center"/>
         <w:tblLook w:firstColumn="1" w:firstRow="1" w:lastColumn="0" w:lastRow="0" w:noHBand="0" w:noVBand="1" w:val="04A0"/>
+        <w:tblBorders>
+          <w:top w:val="single" w:sz="4" w:space="0" w:color="CBD5E1"/>
+          <w:bottom w:val="single" w:sz="4" w:space="0" w:color="CBD5E1"/>
+          <w:insideH w:val="single" w:sz="4" w:space="0" w:color="CBD5E1"/>
+          <w:insideV w:val="single" w:sz="4" w:space="0" w:color="CBD5E1"/>
+          <w:left w:val="none"/>
+          <w:right w:val="none"/>
+        </w:tblBorders>
       </w:tblPr>
       <w:tblGrid>
         <w:gridCol w:w="4680"/>
@@ -17513,28 +17618,15 @@
         </w:trPr>
         <w:tc>
           <w:tcPr>
-            <w:tcW w:type="dxa" w:w="4680"/>
-            <w:shd w:fill="0F172A"/>
-            <w:tcMar>
-              <w:top w:w="120" w:type="dxa"/>
-              <w:bottom w:w="120" w:type="dxa"/>
-              <w:left w:w="150" w:type="dxa"/>
-              <w:right w:w="150" w:type="dxa"/>
-            </w:tcMar>
+            <w:tcW w:type="dxa" w:w="2880"/>
             <w:shd w:fill="1E293B"/>
-            <w:tcMar>
-              <w:top w:w="120" w:type="dxa"/>
-              <w:bottom w:w="120" w:type="dxa"/>
-              <w:left w:w="140" w:type="dxa"/>
-              <w:right w:w="140" w:type="dxa"/>
-            </w:tcMar>
-            <w:vAlign w:val="center"/>
-          </w:tcPr>
-          <w:p>
-            <w:pPr>
-              <w:spacing w:before="0" w:after="0"/>
-              <w:jc w:val="left"/>
-            </w:pPr>
+          </w:tcPr>
+          <w:p>
+            <w:pPr>
+              <w:spacing w:line="264" w:lineRule="auto" w:before="40" w:after="40"/>
+              <w:jc w:val="left"/>
+            </w:pPr>
+            <w:r/>
             <w:r>
               <w:rPr>
                 <w:rFonts w:ascii="Arial" w:hAnsi="Arial"/>
@@ -17542,34 +17634,21 @@
                 <w:color w:val="FFFFFF"/>
                 <w:sz w:val="19"/>
               </w:rPr>
-              <w:t>Artefacto en la Cadena</w:t>
-            </w:r>
-          </w:p>
-        </w:tc>
-        <w:tc>
-          <w:tcPr>
-            <w:tcW w:type="dxa" w:w="4680"/>
-            <w:shd w:fill="0F172A"/>
-            <w:tcMar>
-              <w:top w:w="120" w:type="dxa"/>
-              <w:bottom w:w="120" w:type="dxa"/>
-              <w:left w:w="150" w:type="dxa"/>
-              <w:right w:w="150" w:type="dxa"/>
-            </w:tcMar>
+              <w:t>Campo Específico</w:t>
+            </w:r>
+          </w:p>
+        </w:tc>
+        <w:tc>
+          <w:tcPr>
+            <w:tcW w:type="dxa" w:w="6912"/>
             <w:shd w:fill="1E293B"/>
-            <w:tcMar>
-              <w:top w:w="120" w:type="dxa"/>
-              <w:bottom w:w="120" w:type="dxa"/>
-              <w:left w:w="140" w:type="dxa"/>
-              <w:right w:w="140" w:type="dxa"/>
-            </w:tcMar>
-            <w:vAlign w:val="center"/>
-          </w:tcPr>
-          <w:p>
-            <w:pPr>
-              <w:spacing w:before="0" w:after="0"/>
-              <w:jc w:val="left"/>
-            </w:pPr>
+          </w:tcPr>
+          <w:p>
+            <w:pPr>
+              <w:spacing w:line="264" w:lineRule="auto" w:before="40" w:after="40"/>
+              <w:jc w:val="left"/>
+            </w:pPr>
+            <w:r/>
             <w:r>
               <w:rPr>
                 <w:rFonts w:ascii="Arial" w:hAnsi="Arial"/>
@@ -17577,7 +17656,7 @@
                 <w:color w:val="FFFFFF"/>
                 <w:sz w:val="19"/>
               </w:rPr>
-              <w:t>Especificación Técnica y Valor para el Proyecto</w:t>
+              <w:t>Detalle Operativo del Caso de Uso Específico</w:t>
             </w:r>
           </w:p>
         </w:tc>
@@ -17588,69 +17667,45 @@
         </w:trPr>
         <w:tc>
           <w:tcPr>
-            <w:tcW w:type="dxa" w:w="4680"/>
+            <w:tcW w:type="dxa" w:w="2880"/>
             <w:shd w:fill="F8FAFC"/>
-            <w:tcMar>
-              <w:top w:w="80" w:type="dxa"/>
-              <w:bottom w:w="80" w:type="dxa"/>
-              <w:left w:w="120" w:type="dxa"/>
-              <w:right w:w="120" w:type="dxa"/>
-            </w:tcMar>
-            <w:shd w:fill="F8FAFC"/>
-            <w:tcMar>
-              <w:top w:w="70" w:type="dxa"/>
-              <w:bottom w:w="70" w:type="dxa"/>
-              <w:left w:w="120" w:type="dxa"/>
-              <w:right w:w="120" w:type="dxa"/>
-            </w:tcMar>
-            <w:vAlign w:val="center"/>
-          </w:tcPr>
-          <w:p>
-            <w:pPr>
-              <w:spacing w:line="252" w:lineRule="auto" w:before="0" w:after="0"/>
-              <w:jc w:val="left"/>
-            </w:pPr>
-            <w:r>
-              <w:rPr>
-                <w:rFonts w:ascii="Arial" w:hAnsi="Arial"/>
+          </w:tcPr>
+          <w:p>
+            <w:pPr>
+              <w:spacing w:line="264" w:lineRule="auto" w:before="40" w:after="40"/>
+              <w:jc w:val="left"/>
+            </w:pPr>
+            <w:r/>
+            <w:r>
+              <w:rPr>
+                <w:rFonts w:ascii="Arial" w:hAnsi="Arial"/>
+                <w:b/>
                 <w:color w:val="1E293B"/>
                 <w:sz w:val="18"/>
               </w:rPr>
-              <w:t>1. Requerimiento Funcional</w:t>
-            </w:r>
-          </w:p>
-        </w:tc>
-        <w:tc>
-          <w:tcPr>
-            <w:tcW w:type="dxa" w:w="4680"/>
+              <w:t>Nombre del Caso de Uso</w:t>
+            </w:r>
+          </w:p>
+        </w:tc>
+        <w:tc>
+          <w:tcPr>
+            <w:tcW w:type="dxa" w:w="6912"/>
             <w:shd w:fill="F8FAFC"/>
-            <w:tcMar>
-              <w:top w:w="80" w:type="dxa"/>
-              <w:bottom w:w="80" w:type="dxa"/>
-              <w:left w:w="120" w:type="dxa"/>
-              <w:right w:w="120" w:type="dxa"/>
-            </w:tcMar>
-            <w:shd w:fill="F8FAFC"/>
-            <w:tcMar>
-              <w:top w:w="70" w:type="dxa"/>
-              <w:bottom w:w="70" w:type="dxa"/>
-              <w:left w:w="120" w:type="dxa"/>
-              <w:right w:w="120" w:type="dxa"/>
-            </w:tcMar>
-            <w:vAlign w:val="center"/>
-          </w:tcPr>
-          <w:p>
-            <w:pPr>
-              <w:spacing w:line="252" w:lineRule="auto" w:before="0" w:after="0"/>
-              <w:jc w:val="left"/>
-            </w:pPr>
-            <w:r>
-              <w:rPr>
-                <w:rFonts w:ascii="Arial" w:hAnsi="Arial"/>
-                <w:color w:val="1E293B"/>
+          </w:tcPr>
+          <w:p>
+            <w:pPr>
+              <w:spacing w:line="264" w:lineRule="auto" w:before="40" w:after="40"/>
+              <w:jc w:val="left"/>
+            </w:pPr>
+            <w:r/>
+            <w:r>
+              <w:rPr>
+                <w:rFonts w:ascii="Arial" w:hAnsi="Arial"/>
+                <w:b w:val="0"/>
+                <w:color w:val="334155"/>
                 <w:sz w:val="18"/>
               </w:rPr>
-              <w:t>RF-016: Registro Centralizado de Gestiones Comunales y Derivación Opcional al Tubo de Trabajo.</w:t>
+              <w:t>CU-01.2: Registrar Nueva Gestión con Activación de Tubo de Trabajo</w:t>
             </w:r>
           </w:p>
         </w:tc>
@@ -17661,67 +17716,45 @@
         </w:trPr>
         <w:tc>
           <w:tcPr>
-            <w:tcW w:type="dxa" w:w="4680"/>
-            <w:tcMar>
-              <w:top w:w="80" w:type="dxa"/>
-              <w:bottom w:w="80" w:type="dxa"/>
-              <w:left w:w="120" w:type="dxa"/>
-              <w:right w:w="120" w:type="dxa"/>
-            </w:tcMar>
+            <w:tcW w:type="dxa" w:w="2880"/>
             <w:shd w:fill="FFFFFF"/>
-            <w:tcMar>
-              <w:top w:w="70" w:type="dxa"/>
-              <w:bottom w:w="70" w:type="dxa"/>
-              <w:left w:w="120" w:type="dxa"/>
-              <w:right w:w="120" w:type="dxa"/>
-            </w:tcMar>
-            <w:vAlign w:val="center"/>
-          </w:tcPr>
-          <w:p>
-            <w:pPr>
-              <w:spacing w:line="252" w:lineRule="auto" w:before="0" w:after="0"/>
-              <w:jc w:val="left"/>
-            </w:pPr>
-            <w:r>
-              <w:rPr>
-                <w:rFonts w:ascii="Arial" w:hAnsi="Arial"/>
+          </w:tcPr>
+          <w:p>
+            <w:pPr>
+              <w:spacing w:line="264" w:lineRule="auto" w:before="40" w:after="40"/>
+              <w:jc w:val="left"/>
+            </w:pPr>
+            <w:r/>
+            <w:r>
+              <w:rPr>
+                <w:rFonts w:ascii="Arial" w:hAnsi="Arial"/>
+                <w:b/>
                 <w:color w:val="1E293B"/>
                 <w:sz w:val="18"/>
               </w:rPr>
-              <w:t>2. Épica del Backlog</w:t>
-            </w:r>
-          </w:p>
-        </w:tc>
-        <w:tc>
-          <w:tcPr>
-            <w:tcW w:type="dxa" w:w="4680"/>
-            <w:tcMar>
-              <w:top w:w="80" w:type="dxa"/>
-              <w:bottom w:w="80" w:type="dxa"/>
-              <w:left w:w="120" w:type="dxa"/>
-              <w:right w:w="120" w:type="dxa"/>
-            </w:tcMar>
+              <w:t>Actor(es) Principales</w:t>
+            </w:r>
+          </w:p>
+        </w:tc>
+        <w:tc>
+          <w:tcPr>
+            <w:tcW w:type="dxa" w:w="6912"/>
             <w:shd w:fill="FFFFFF"/>
-            <w:tcMar>
-              <w:top w:w="70" w:type="dxa"/>
-              <w:bottom w:w="70" w:type="dxa"/>
-              <w:left w:w="120" w:type="dxa"/>
-              <w:right w:w="120" w:type="dxa"/>
-            </w:tcMar>
-            <w:vAlign w:val="center"/>
-          </w:tcPr>
-          <w:p>
-            <w:pPr>
-              <w:spacing w:line="252" w:lineRule="auto" w:before="0" w:after="0"/>
-              <w:jc w:val="left"/>
-            </w:pPr>
-            <w:r>
-              <w:rPr>
-                <w:rFonts w:ascii="Arial" w:hAnsi="Arial"/>
-                <w:color w:val="1E293B"/>
+          </w:tcPr>
+          <w:p>
+            <w:pPr>
+              <w:spacing w:line="264" w:lineRule="auto" w:before="40" w:after="40"/>
+              <w:jc w:val="left"/>
+            </w:pPr>
+            <w:r/>
+            <w:r>
+              <w:rPr>
+                <w:rFonts w:ascii="Arial" w:hAnsi="Arial"/>
+                <w:b w:val="0"/>
+                <w:color w:val="334155"/>
                 <w:sz w:val="18"/>
               </w:rPr>
-              <w:t>EP-01: Gestión Centralizada de Demandas Ciudadanas y Derivación Intersectorial.</w:t>
+              <w:t>Funcionario / Operador Territorial (iniciador), Delegado Municipal (iniciador).</w:t>
             </w:r>
           </w:p>
         </w:tc>
@@ -17732,69 +17765,49 @@
         </w:trPr>
         <w:tc>
           <w:tcPr>
-            <w:tcW w:type="dxa" w:w="4680"/>
+            <w:tcW w:type="dxa" w:w="2880"/>
             <w:shd w:fill="F8FAFC"/>
-            <w:tcMar>
-              <w:top w:w="80" w:type="dxa"/>
-              <w:bottom w:w="80" w:type="dxa"/>
-              <w:left w:w="120" w:type="dxa"/>
-              <w:right w:w="120" w:type="dxa"/>
-            </w:tcMar>
-            <w:shd w:fill="F8FAFC"/>
-            <w:tcMar>
-              <w:top w:w="70" w:type="dxa"/>
-              <w:bottom w:w="70" w:type="dxa"/>
-              <w:left w:w="120" w:type="dxa"/>
-              <w:right w:w="120" w:type="dxa"/>
-            </w:tcMar>
-            <w:vAlign w:val="center"/>
-          </w:tcPr>
-          <w:p>
-            <w:pPr>
-              <w:spacing w:line="252" w:lineRule="auto" w:before="0" w:after="0"/>
-              <w:jc w:val="left"/>
-            </w:pPr>
-            <w:r>
-              <w:rPr>
-                <w:rFonts w:ascii="Arial" w:hAnsi="Arial"/>
+          </w:tcPr>
+          <w:p>
+            <w:pPr>
+              <w:spacing w:line="264" w:lineRule="auto" w:before="40" w:after="40"/>
+              <w:jc w:val="left"/>
+            </w:pPr>
+            <w:r/>
+            <w:r>
+              <w:rPr>
+                <w:rFonts w:ascii="Arial" w:hAnsi="Arial"/>
+                <w:b/>
                 <w:color w:val="1E293B"/>
                 <w:sz w:val="18"/>
               </w:rPr>
-              <w:t>3. Caso de Uso Alto Nivel</w:t>
-            </w:r>
-          </w:p>
-        </w:tc>
-        <w:tc>
-          <w:tcPr>
-            <w:tcW w:type="dxa" w:w="4680"/>
+              <w:t>Precondiciones</w:t>
+            </w:r>
+          </w:p>
+        </w:tc>
+        <w:tc>
+          <w:tcPr>
+            <w:tcW w:type="dxa" w:w="6912"/>
             <w:shd w:fill="F8FAFC"/>
-            <w:tcMar>
-              <w:top w:w="80" w:type="dxa"/>
-              <w:bottom w:w="80" w:type="dxa"/>
-              <w:left w:w="120" w:type="dxa"/>
-              <w:right w:w="120" w:type="dxa"/>
-            </w:tcMar>
-            <w:shd w:fill="F8FAFC"/>
-            <w:tcMar>
-              <w:top w:w="70" w:type="dxa"/>
-              <w:bottom w:w="70" w:type="dxa"/>
-              <w:left w:w="120" w:type="dxa"/>
-              <w:right w:w="120" w:type="dxa"/>
-            </w:tcMar>
-            <w:vAlign w:val="center"/>
-          </w:tcPr>
-          <w:p>
-            <w:pPr>
-              <w:spacing w:line="252" w:lineRule="auto" w:before="0" w:after="0"/>
-              <w:jc w:val="left"/>
-            </w:pPr>
-            <w:r>
-              <w:rPr>
-                <w:rFonts w:ascii="Arial" w:hAnsi="Arial"/>
-                <w:color w:val="1E293B"/>
+          </w:tcPr>
+          <w:p>
+            <w:pPr>
+              <w:spacing w:line="264" w:lineRule="auto" w:before="40" w:after="40"/>
+              <w:jc w:val="left"/>
+            </w:pPr>
+            <w:r/>
+            <w:r>
+              <w:rPr>
+                <w:rFonts w:ascii="Arial" w:hAnsi="Arial"/>
+                <w:b w:val="0"/>
+                <w:color w:val="334155"/>
                 <w:sz w:val="18"/>
               </w:rPr>
-              <w:t>CU-01: Administrar Gestiones Ciudadanas y Territoriales.</w:t>
+              <w:t>1. Funcionario autenticado en sesión activa.</w:t>
+              <w:br/>
+              <w:t>2. Delegación territorial asignada.</w:t>
+              <w:br/>
+              <w:t>3. Catálogos temáticos y funcionarios activos en base de datos.</w:t>
             </w:r>
           </w:p>
         </w:tc>
@@ -17805,67 +17818,63 @@
         </w:trPr>
         <w:tc>
           <w:tcPr>
-            <w:tcW w:type="dxa" w:w="4680"/>
-            <w:tcMar>
-              <w:top w:w="80" w:type="dxa"/>
-              <w:bottom w:w="80" w:type="dxa"/>
-              <w:left w:w="120" w:type="dxa"/>
-              <w:right w:w="120" w:type="dxa"/>
-            </w:tcMar>
+            <w:tcW w:type="dxa" w:w="2880"/>
             <w:shd w:fill="FFFFFF"/>
-            <w:tcMar>
-              <w:top w:w="70" w:type="dxa"/>
-              <w:bottom w:w="70" w:type="dxa"/>
-              <w:left w:w="120" w:type="dxa"/>
-              <w:right w:w="120" w:type="dxa"/>
-            </w:tcMar>
-            <w:vAlign w:val="center"/>
-          </w:tcPr>
-          <w:p>
-            <w:pPr>
-              <w:spacing w:line="252" w:lineRule="auto" w:before="0" w:after="0"/>
-              <w:jc w:val="left"/>
-            </w:pPr>
-            <w:r>
-              <w:rPr>
-                <w:rFonts w:ascii="Arial" w:hAnsi="Arial"/>
+          </w:tcPr>
+          <w:p>
+            <w:pPr>
+              <w:spacing w:line="264" w:lineRule="auto" w:before="40" w:after="40"/>
+              <w:jc w:val="left"/>
+            </w:pPr>
+            <w:r/>
+            <w:r>
+              <w:rPr>
+                <w:rFonts w:ascii="Arial" w:hAnsi="Arial"/>
+                <w:b/>
                 <w:color w:val="1E293B"/>
                 <w:sz w:val="18"/>
               </w:rPr>
-              <w:t>4. Caso de Uso Específico</w:t>
-            </w:r>
-          </w:p>
-        </w:tc>
-        <w:tc>
-          <w:tcPr>
-            <w:tcW w:type="dxa" w:w="4680"/>
-            <w:tcMar>
-              <w:top w:w="80" w:type="dxa"/>
-              <w:bottom w:w="80" w:type="dxa"/>
-              <w:left w:w="120" w:type="dxa"/>
-              <w:right w:w="120" w:type="dxa"/>
-            </w:tcMar>
+              <w:t>Flujo Principal (Exitoso)</w:t>
+            </w:r>
+          </w:p>
+        </w:tc>
+        <w:tc>
+          <w:tcPr>
+            <w:tcW w:type="dxa" w:w="6912"/>
             <w:shd w:fill="FFFFFF"/>
-            <w:tcMar>
-              <w:top w:w="70" w:type="dxa"/>
-              <w:bottom w:w="70" w:type="dxa"/>
-              <w:left w:w="120" w:type="dxa"/>
-              <w:right w:w="120" w:type="dxa"/>
-            </w:tcMar>
-            <w:vAlign w:val="center"/>
-          </w:tcPr>
-          <w:p>
-            <w:pPr>
-              <w:spacing w:line="252" w:lineRule="auto" w:before="0" w:after="0"/>
-              <w:jc w:val="left"/>
-            </w:pPr>
-            <w:r>
-              <w:rPr>
-                <w:rFonts w:ascii="Arial" w:hAnsi="Arial"/>
-                <w:color w:val="1E293B"/>
+          </w:tcPr>
+          <w:p>
+            <w:pPr>
+              <w:spacing w:line="264" w:lineRule="auto" w:before="40" w:after="40"/>
+              <w:jc w:val="left"/>
+            </w:pPr>
+            <w:r/>
+            <w:r>
+              <w:rPr>
+                <w:rFonts w:ascii="Arial" w:hAnsi="Arial"/>
+                <w:b w:val="0"/>
+                <w:color w:val="334155"/>
                 <w:sz w:val="18"/>
               </w:rPr>
-              <w:t>CU-01.2: Registrar Nueva Gestión con Activación de Tubo de Trabajo (con cuadro normalizado).</w:t>
+              <w:t>1. El actor ingresa al módulo de Gestiones y presiona 'Nueva Gestión' (/actividades/nueva/).</w:t>
+              <w:br/>
+              <w:t>2. El sistema despliega el formulario unificado con fecha actual y folio sugerido GES-XXXXX.</w:t>
+              <w:br/>
+              <w:t>3. El actor ingresa los datos del solicitante (nombre, RUT, teléfono, dirección y territorio).</w:t>
+              <w:br/>
+              <w:t>4. El actor selecciona el Tipo de Atención; el sistema carga asíncronamente (AJAX) las SubAtenciones relacionadas.</w:t>
+              <w:br/>
+              <w:t>5. El actor describe la solicitud vecinal y la acción de respuesta institucional.</w:t>
+              <w:br/>
+              <w:t>6. El actor activa el switch reactivo '¿Derivar al Tubo de Trabajo? = SÍ'.</w:t>
+              <w:br/>
+              <w:t>7. El sistema despliega la sección del Tubo solicitando fecha comprometida y área municipal de apoyo.</w:t>
+              <w:br/>
+              <w:t>8. El actor presiona 'Guardar Gestión y Generar Folio Oficial'.</w:t>
+              <w:br/>
+              <w:t>9. El sistema inicia transacción atómica en MySQL, inserta la gestión, genera el código correlativo de Tubo TUB-XXXXX con FK vinculada y asigna el código inmutable de evidencia EVI-YYYYMMDD-XXXX.</w:t>
+              <w:br/>
+              <w:t>10. El sistema redirige al Libro General de Gestiones confirmando el éxito con SweetAlert2.</w:t>
             </w:r>
           </w:p>
         </w:tc>
@@ -17876,69 +17885,96 @@
         </w:trPr>
         <w:tc>
           <w:tcPr>
-            <w:tcW w:type="dxa" w:w="4680"/>
+            <w:tcW w:type="dxa" w:w="2880"/>
             <w:shd w:fill="F8FAFC"/>
-            <w:tcMar>
-              <w:top w:w="80" w:type="dxa"/>
-              <w:bottom w:w="80" w:type="dxa"/>
-              <w:left w:w="120" w:type="dxa"/>
-              <w:right w:w="120" w:type="dxa"/>
-            </w:tcMar>
-            <w:shd w:fill="F8FAFC"/>
-            <w:tcMar>
-              <w:top w:w="70" w:type="dxa"/>
-              <w:bottom w:w="70" w:type="dxa"/>
-              <w:left w:w="120" w:type="dxa"/>
-              <w:right w:w="120" w:type="dxa"/>
-            </w:tcMar>
-            <w:vAlign w:val="center"/>
-          </w:tcPr>
-          <w:p>
-            <w:pPr>
-              <w:spacing w:line="252" w:lineRule="auto" w:before="0" w:after="0"/>
-              <w:jc w:val="left"/>
-            </w:pPr>
-            <w:r>
-              <w:rPr>
-                <w:rFonts w:ascii="Arial" w:hAnsi="Arial"/>
+          </w:tcPr>
+          <w:p>
+            <w:pPr>
+              <w:spacing w:line="264" w:lineRule="auto" w:before="40" w:after="40"/>
+              <w:jc w:val="left"/>
+            </w:pPr>
+            <w:r/>
+            <w:r>
+              <w:rPr>
+                <w:rFonts w:ascii="Arial" w:hAnsi="Arial"/>
+                <w:b/>
                 <w:color w:val="1E293B"/>
                 <w:sz w:val="18"/>
               </w:rPr>
-              <w:t>5. Wireframe Front-End</w:t>
-            </w:r>
-          </w:p>
-        </w:tc>
-        <w:tc>
-          <w:tcPr>
-            <w:tcW w:type="dxa" w:w="4680"/>
+              <w:t>Flujos Alternativos / Excepciones</w:t>
+            </w:r>
+          </w:p>
+        </w:tc>
+        <w:tc>
+          <w:tcPr>
+            <w:tcW w:type="dxa" w:w="6912"/>
             <w:shd w:fill="F8FAFC"/>
-            <w:tcMar>
-              <w:top w:w="80" w:type="dxa"/>
-              <w:bottom w:w="80" w:type="dxa"/>
-              <w:left w:w="120" w:type="dxa"/>
-              <w:right w:w="120" w:type="dxa"/>
-            </w:tcMar>
-            <w:shd w:fill="F8FAFC"/>
-            <w:tcMar>
-              <w:top w:w="70" w:type="dxa"/>
-              <w:bottom w:w="70" w:type="dxa"/>
-              <w:left w:w="120" w:type="dxa"/>
-              <w:right w:w="120" w:type="dxa"/>
-            </w:tcMar>
-            <w:vAlign w:val="center"/>
-          </w:tcPr>
-          <w:p>
-            <w:pPr>
-              <w:spacing w:line="252" w:lineRule="auto" w:before="0" w:after="0"/>
-              <w:jc w:val="left"/>
-            </w:pPr>
-            <w:r>
-              <w:rPr>
-                <w:rFonts w:ascii="Arial" w:hAnsi="Arial"/>
+          </w:tcPr>
+          <w:p>
+            <w:pPr>
+              <w:spacing w:line="264" w:lineRule="auto" w:before="40" w:after="40"/>
+              <w:jc w:val="left"/>
+            </w:pPr>
+            <w:r/>
+            <w:r>
+              <w:rPr>
+                <w:rFonts w:ascii="Arial" w:hAnsi="Arial"/>
+                <w:b w:val="0"/>
+                <w:color w:val="334155"/>
+                <w:sz w:val="18"/>
+              </w:rPr>
+              <w:t>A1. Caso Social Especializado: Si se activa '¿Es Gestión Social?', el folio cambia automáticamente a SOC-XXXXX y se despliega la ficha multi-etapa (Visitas, Encuesta FIBE, Ayuda Social).</w:t>
+              <w:br/>
+              <w:t>A2. Omisión de Campos Obligatorios: El sistema detiene el guardado, resalta en rojo los campos requeridos y notifica al usuario sin perder los datos ya digitados.</w:t>
+            </w:r>
+          </w:p>
+        </w:tc>
+      </w:tr>
+      <w:tr>
+        <w:trPr>
+          <w:cantSplit/>
+        </w:trPr>
+        <w:tc>
+          <w:tcPr>
+            <w:tcW w:type="dxa" w:w="2880"/>
+            <w:shd w:fill="FFFFFF"/>
+          </w:tcPr>
+          <w:p>
+            <w:pPr>
+              <w:spacing w:line="264" w:lineRule="auto" w:before="40" w:after="40"/>
+              <w:jc w:val="left"/>
+            </w:pPr>
+            <w:r/>
+            <w:r>
+              <w:rPr>
+                <w:rFonts w:ascii="Arial" w:hAnsi="Arial"/>
+                <w:b/>
                 <w:color w:val="1E293B"/>
                 <w:sz w:val="18"/>
               </w:rPr>
-              <w:t>Pantalla de Registro Unificado con catálogo en cascada AJAX y acordeón reactivo (#seccionTubo).</w:t>
+              <w:t>Postcondiciones</w:t>
+            </w:r>
+          </w:p>
+        </w:tc>
+        <w:tc>
+          <w:tcPr>
+            <w:tcW w:type="dxa" w:w="6912"/>
+            <w:shd w:fill="FFFFFF"/>
+          </w:tcPr>
+          <w:p>
+            <w:pPr>
+              <w:spacing w:line="264" w:lineRule="auto" w:before="40" w:after="40"/>
+              <w:jc w:val="left"/>
+            </w:pPr>
+            <w:r/>
+            <w:r>
+              <w:rPr>
+                <w:rFonts w:ascii="Arial" w:hAnsi="Arial"/>
+                <w:b w:val="0"/>
+                <w:color w:val="334155"/>
+                <w:sz w:val="18"/>
+              </w:rPr>
+              <w:t>La gestión queda consolidada en el Libro General y la tarjeta operativa aparece de inmediato en la columna 'Ingresado' del Tablero Kanban del Tubo.</w:t>
             </w:r>
           </w:p>
         </w:tc>
@@ -17946,17 +17982,40 @@
     </w:tbl>
     <w:p>
       <w:pPr>
-        <w:spacing w:before="160" w:after="60"/>
-        <w:jc w:val="left"/>
+        <w:spacing w:line="276" w:lineRule="auto" w:after="120" w:before="120"/>
+        <w:jc w:val="both"/>
       </w:pPr>
       <w:r>
         <w:rPr>
           <w:rFonts w:ascii="Arial" w:hAnsi="Arial"/>
           <w:b/>
-          <w:color w:val="1E3A8A"/>
+          <w:color w:val="1E293B"/>
+          <w:sz w:val="22"/>
+        </w:rPr>
+        <w:t xml:space="preserve">5. Wireframe (Front-End): </w:t>
+      </w:r>
+      <w:r>
+        <w:rPr>
+          <w:rFonts w:ascii="Arial" w:hAnsi="Arial"/>
+          <w:color w:val="334155"/>
+          <w:sz w:val="22"/>
+        </w:rPr>
+        <w:t>A continuación se presenta el Wireframe Front-End implementado en la plataforma web que materializa el Caso de Uso CU-01.2 y el Requerimiento Funcional RF-016:</w:t>
+      </w:r>
+    </w:p>
+    <w:p>
+      <w:pPr>
+        <w:spacing w:line="276" w:lineRule="auto" w:after="60" w:before="120"/>
+        <w:jc w:val="center"/>
+      </w:pPr>
+      <w:r>
+        <w:rPr>
+          <w:rFonts w:ascii="Arial" w:hAnsi="Arial"/>
+          <w:b/>
+          <w:color w:val="0F172A"/>
           <w:sz w:val="21"/>
         </w:rPr>
-        <w:t>Cuadro Normalizado: Caso de Uso Específico CU-01.2</w:t>
+        <w:t>Figura 1: Wireframe Front-End — Formulario Unificado de Registro de Gestión y Derivación al Tubo</w:t>
       </w:r>
     </w:p>
     <w:tbl>
@@ -17964,6 +18023,220 @@
         <w:tblW w:type="auto" w:w="0"/>
         <w:jc w:val="center"/>
         <w:tblLook w:firstColumn="1" w:firstRow="1" w:lastColumn="0" w:lastRow="0" w:noHBand="0" w:noVBand="1" w:val="04A0"/>
+        <w:tblBorders>
+          <w:top w:val="dashed" w:sz="8" w:space="0" w:color="94A3B8"/>
+          <w:bottom w:val="dashed" w:sz="8" w:space="0" w:color="94A3B8"/>
+          <w:left w:val="dashed" w:sz="8" w:space="0" w:color="94A3B8"/>
+          <w:right w:val="dashed" w:sz="8" w:space="0" w:color="94A3B8"/>
+          <w:insideH w:val="none"/>
+          <w:insideV w:val="none"/>
+        </w:tblBorders>
+      </w:tblPr>
+      <w:tblGrid>
+        <w:gridCol w:w="9360"/>
+      </w:tblGrid>
+      <w:tr>
+        <w:trPr>
+          <w:cantSplit/>
+        </w:trPr>
+        <w:tc>
+          <w:tcPr>
+            <w:tcW w:type="dxa" w:w="9792"/>
+            <w:shd w:fill="F8FAFC"/>
+          </w:tcPr>
+          <w:p>
+            <w:pPr>
+              <w:spacing w:line="300" w:lineRule="auto" w:before="560" w:after="560"/>
+              <w:jc w:val="center"/>
+            </w:pPr>
+            <w:r/>
+            <w:r>
+              <w:rPr>
+                <w:rFonts w:ascii="Arial" w:hAnsi="Arial"/>
+                <w:b/>
+                <w:color w:val="2563EB"/>
+                <w:sz w:val="23"/>
+              </w:rPr>
+              <w:t>📷 [ PEGAR AQUÍ CAPTURA DE PANTALLA / WIREFRAME FRONT-END ]</w:t>
+              <w:br/>
+            </w:r>
+            <w:r>
+              <w:rPr>
+                <w:rFonts w:ascii="Arial" w:hAnsi="Arial"/>
+                <w:b/>
+                <w:color w:val="1E293B"/>
+                <w:sz w:val="20"/>
+              </w:rPr>
+              <w:t>Pantalla: Formulario Unificado de Registro de Gestión y Derivación al Tubo</w:t>
+              <w:br/>
+            </w:r>
+            <w:r>
+              <w:rPr>
+                <w:rFonts w:ascii="Consolas" w:hAnsi="Consolas"/>
+                <w:color w:val="0F766E"/>
+                <w:sz w:val="19"/>
+              </w:rPr>
+              <w:t>URL de Acceso en Servidor Cloud: http://3.229.11.31/actividades/nueva/</w:t>
+              <w:br/>
+            </w:r>
+            <w:r>
+              <w:rPr>
+                <w:rFonts w:ascii="Arial" w:hAnsi="Arial"/>
+                <w:color w:val="64748B"/>
+                <w:sz w:val="18"/>
+              </w:rPr>
+              <w:t>Usuario de Prueba: funcionario_compa | Contraseña: pass1234</w:t>
+              <w:br/>
+              <w:br/>
+            </w:r>
+            <w:r>
+              <w:rPr>
+                <w:rFonts w:ascii="Arial" w:hAnsi="Arial"/>
+                <w:i/>
+                <w:color w:val="94A3B8"/>
+                <w:sz w:val="17"/>
+              </w:rPr>
+              <w:t>(Haz clic en este recuadro y presiona Ctrl+V para pegar directamente el pantallazo tomado desde el navegador)</w:t>
+            </w:r>
+          </w:p>
+        </w:tc>
+      </w:tr>
+    </w:tbl>
+    <w:p>
+      <w:pPr>
+        <w:spacing w:line="276" w:lineRule="auto" w:after="200" w:before="80"/>
+        <w:jc w:val="both"/>
+      </w:pPr>
+      <w:r>
+        <w:rPr>
+          <w:rFonts w:ascii="Arial" w:hAnsi="Arial"/>
+          <w:i/>
+          <w:color w:val="475569"/>
+          <w:sz w:val="19"/>
+        </w:rPr>
+        <w:t>Componentes Clave a Visualizar en la Interfaz: Encabezado de auditoría con Folio sugerido [GES-XXXXX], Código de evidencia [EVI-YYYYMMDD-XXXX], Datos completos del vecino solicitante, Clasificación temática en cascada AJAX (Tipo ➔ Subatención), Requerimiento y acción municipal, Switch reactivo del Tubo de Trabajo con campos desplegables (Fecha límite y Área de apoyo), y botones de guardado institucional.</w:t>
+      </w:r>
+    </w:p>
+    <w:p>
+      <w:pPr>
+        <w:pStyle w:val="Heading3"/>
+        <w:spacing w:before="280" w:after="80"/>
+      </w:pPr>
+      <w:r>
+        <w:rPr>
+          <w:rFonts w:ascii="Arial" w:hAnsi="Arial"/>
+          <w:b/>
+          <w:color w:val="1E293B"/>
+          <w:sz w:val="22"/>
+        </w:rPr>
+        <w:t>3.7.2 Flujo Operativo 2: Tablero Kanban Intersectorial del Método Tubo de Trabajo</w:t>
+      </w:r>
+    </w:p>
+    <w:p>
+      <w:pPr>
+        <w:spacing w:line="276" w:lineRule="auto" w:after="120" w:before="0"/>
+        <w:jc w:val="both"/>
+      </w:pPr>
+      <w:r>
+        <w:rPr>
+          <w:rFonts w:ascii="Arial" w:hAnsi="Arial"/>
+          <w:b/>
+          <w:color w:val="1E293B"/>
+          <w:sz w:val="22"/>
+        </w:rPr>
+        <w:t xml:space="preserve">1. Requerimiento Funcional (RF): </w:t>
+      </w:r>
+      <w:r>
+        <w:rPr>
+          <w:rFonts w:ascii="Arial" w:hAnsi="Arial"/>
+          <w:color w:val="334155"/>
+          <w:sz w:val="22"/>
+        </w:rPr>
+        <w:t>RF-017: Tablero Kanban Intersectorial del Método Tubo de Trabajo (Asociado a RF07). El sistema debe proporcionar una interfaz visual en formato Kanban con 4 columnas secuenciales (Ingresado, Pendiente, En Proceso, Realizado), permitiendo a delegados y coordinadores monitorear en tiempo real los compromisos derivados, filtrar por delegación, transicionar estados en un solo clic e inspeccionar la gestión territorial de origen mediante insignias interactivas [GES-XXXXX] o [SOC-XXXXX].</w:t>
+      </w:r>
+    </w:p>
+    <w:p>
+      <w:pPr>
+        <w:spacing w:line="276" w:lineRule="auto" w:after="120" w:before="0"/>
+        <w:jc w:val="both"/>
+      </w:pPr>
+      <w:r>
+        <w:rPr>
+          <w:rFonts w:ascii="Arial" w:hAnsi="Arial"/>
+          <w:b/>
+          <w:color w:val="1E293B"/>
+          <w:sz w:val="22"/>
+        </w:rPr>
+        <w:t xml:space="preserve">2. Épica del Backlog: </w:t>
+      </w:r>
+      <w:r>
+        <w:rPr>
+          <w:rFonts w:ascii="Arial" w:hAnsi="Arial"/>
+          <w:color w:val="334155"/>
+          <w:sz w:val="22"/>
+        </w:rPr>
+        <w:t>EP-02: Trazabilidad, Coordinación y Control Operativo del Tubo de Trabajo. Otorga visibilidad y seguimiento interdepartamental a los compromisos que requieren coordinación entre unidades (obras, tránsito, aseo y ornato) sin depender de reuniones burocráticas.</w:t>
+      </w:r>
+    </w:p>
+    <w:p>
+      <w:pPr>
+        <w:spacing w:line="276" w:lineRule="auto" w:after="120" w:before="0"/>
+        <w:jc w:val="both"/>
+      </w:pPr>
+      <w:r>
+        <w:rPr>
+          <w:rFonts w:ascii="Arial" w:hAnsi="Arial"/>
+          <w:b/>
+          <w:color w:val="1E293B"/>
+          <w:sz w:val="22"/>
+        </w:rPr>
+        <w:t xml:space="preserve">3. Caso de Uso de Alto Nivel: </w:t>
+      </w:r>
+      <w:r>
+        <w:rPr>
+          <w:rFonts w:ascii="Arial" w:hAnsi="Arial"/>
+          <w:color w:val="334155"/>
+          <w:sz w:val="22"/>
+        </w:rPr>
+        <w:t>CU-02: Gestionar Tubo de Trabajo Municipal. Permite la visualización global, supervisión de plazos, cambio de estados y fiscalización del avance de las demandas vecinales en curso.</w:t>
+      </w:r>
+    </w:p>
+    <w:p>
+      <w:pPr>
+        <w:spacing w:line="276" w:lineRule="auto" w:after="120" w:before="0"/>
+        <w:jc w:val="both"/>
+      </w:pPr>
+      <w:r>
+        <w:rPr>
+          <w:rFonts w:ascii="Arial" w:hAnsi="Arial"/>
+          <w:b/>
+          <w:color w:val="1E293B"/>
+          <w:sz w:val="22"/>
+        </w:rPr>
+        <w:t xml:space="preserve">4. Caso de Uso Específico: </w:t>
+      </w:r>
+      <w:r>
+        <w:rPr>
+          <w:rFonts w:ascii="Arial" w:hAnsi="Arial"/>
+          <w:color w:val="334155"/>
+          <w:sz w:val="22"/>
+        </w:rPr>
+        <w:t>CU-02.1: Visualizar y Transicionar Estados en Tablero Kanban. A continuación se presenta el Cuadro Descriptivo Normalizado que formaliza la dinámica de operación visual del tablero:</w:t>
+      </w:r>
+    </w:p>
+    <w:tbl>
+      <w:tblPr>
+        <w:tblW w:type="auto" w:w="0"/>
+        <w:jc w:val="center"/>
+        <w:tblLook w:firstColumn="1" w:firstRow="1" w:lastColumn="0" w:lastRow="0" w:noHBand="0" w:noVBand="1" w:val="04A0"/>
+        <w:tblBorders>
+          <w:top w:val="single" w:sz="4" w:space="0" w:color="CBD5E1"/>
+          <w:bottom w:val="single" w:sz="4" w:space="0" w:color="CBD5E1"/>
+          <w:insideH w:val="single" w:sz="4" w:space="0" w:color="CBD5E1"/>
+          <w:insideV w:val="single" w:sz="4" w:space="0" w:color="CBD5E1"/>
+          <w:left w:val="none"/>
+          <w:right w:val="none"/>
+        </w:tblBorders>
       </w:tblPr>
       <w:tblGrid>
         <w:gridCol w:w="4680"/>
@@ -17976,28 +18249,15 @@
         </w:trPr>
         <w:tc>
           <w:tcPr>
-            <w:tcW w:type="dxa" w:w="4680"/>
-            <w:shd w:fill="0369A1"/>
-            <w:tcMar>
-              <w:top w:w="120" w:type="dxa"/>
-              <w:bottom w:w="120" w:type="dxa"/>
-              <w:left w:w="150" w:type="dxa"/>
-              <w:right w:w="150" w:type="dxa"/>
-            </w:tcMar>
+            <w:tcW w:type="dxa" w:w="2880"/>
             <w:shd w:fill="1E293B"/>
-            <w:tcMar>
-              <w:top w:w="120" w:type="dxa"/>
-              <w:bottom w:w="120" w:type="dxa"/>
-              <w:left w:w="140" w:type="dxa"/>
-              <w:right w:w="140" w:type="dxa"/>
-            </w:tcMar>
-            <w:vAlign w:val="center"/>
-          </w:tcPr>
-          <w:p>
-            <w:pPr>
-              <w:spacing w:before="0" w:after="0"/>
-              <w:jc w:val="left"/>
-            </w:pPr>
+          </w:tcPr>
+          <w:p>
+            <w:pPr>
+              <w:spacing w:line="264" w:lineRule="auto" w:before="40" w:after="40"/>
+              <w:jc w:val="left"/>
+            </w:pPr>
+            <w:r/>
             <w:r>
               <w:rPr>
                 <w:rFonts w:ascii="Arial" w:hAnsi="Arial"/>
@@ -18011,28 +18271,15 @@
         </w:tc>
         <w:tc>
           <w:tcPr>
-            <w:tcW w:type="dxa" w:w="4680"/>
-            <w:shd w:fill="0369A1"/>
-            <w:tcMar>
-              <w:top w:w="120" w:type="dxa"/>
-              <w:bottom w:w="120" w:type="dxa"/>
-              <w:left w:w="150" w:type="dxa"/>
-              <w:right w:w="150" w:type="dxa"/>
-            </w:tcMar>
+            <w:tcW w:type="dxa" w:w="6912"/>
             <w:shd w:fill="1E293B"/>
-            <w:tcMar>
-              <w:top w:w="120" w:type="dxa"/>
-              <w:bottom w:w="120" w:type="dxa"/>
-              <w:left w:w="140" w:type="dxa"/>
-              <w:right w:w="140" w:type="dxa"/>
-            </w:tcMar>
-            <w:vAlign w:val="center"/>
-          </w:tcPr>
-          <w:p>
-            <w:pPr>
-              <w:spacing w:before="0" w:after="0"/>
-              <w:jc w:val="left"/>
-            </w:pPr>
+          </w:tcPr>
+          <w:p>
+            <w:pPr>
+              <w:spacing w:line="264" w:lineRule="auto" w:before="40" w:after="40"/>
+              <w:jc w:val="left"/>
+            </w:pPr>
+            <w:r/>
             <w:r>
               <w:rPr>
                 <w:rFonts w:ascii="Arial" w:hAnsi="Arial"/>
@@ -18040,7 +18287,7 @@
                 <w:color w:val="FFFFFF"/>
                 <w:sz w:val="19"/>
               </w:rPr>
-              <w:t>Detalle Operativo del Caso de Uso</w:t>
+              <w:t>Detalle Operativo del Caso de Uso Específico</w:t>
             </w:r>
           </w:p>
         </w:tc>
@@ -18051,31 +18298,19 @@
         </w:trPr>
         <w:tc>
           <w:tcPr>
-            <w:tcW w:type="dxa" w:w="4680"/>
+            <w:tcW w:type="dxa" w:w="2880"/>
             <w:shd w:fill="F8FAFC"/>
-            <w:tcMar>
-              <w:top w:w="80" w:type="dxa"/>
-              <w:bottom w:w="80" w:type="dxa"/>
-              <w:left w:w="120" w:type="dxa"/>
-              <w:right w:w="120" w:type="dxa"/>
-            </w:tcMar>
-            <w:shd w:fill="F8FAFC"/>
-            <w:tcMar>
-              <w:top w:w="70" w:type="dxa"/>
-              <w:bottom w:w="70" w:type="dxa"/>
-              <w:left w:w="120" w:type="dxa"/>
-              <w:right w:w="120" w:type="dxa"/>
-            </w:tcMar>
-            <w:vAlign w:val="center"/>
-          </w:tcPr>
-          <w:p>
-            <w:pPr>
-              <w:spacing w:line="252" w:lineRule="auto" w:before="0" w:after="0"/>
-              <w:jc w:val="left"/>
-            </w:pPr>
-            <w:r>
-              <w:rPr>
-                <w:rFonts w:ascii="Arial" w:hAnsi="Arial"/>
+          </w:tcPr>
+          <w:p>
+            <w:pPr>
+              <w:spacing w:line="264" w:lineRule="auto" w:before="40" w:after="40"/>
+              <w:jc w:val="left"/>
+            </w:pPr>
+            <w:r/>
+            <w:r>
+              <w:rPr>
+                <w:rFonts w:ascii="Arial" w:hAnsi="Arial"/>
+                <w:b/>
                 <w:color w:val="1E293B"/>
                 <w:sz w:val="18"/>
               </w:rPr>
@@ -18085,35 +18320,23 @@
         </w:tc>
         <w:tc>
           <w:tcPr>
-            <w:tcW w:type="dxa" w:w="4680"/>
+            <w:tcW w:type="dxa" w:w="6912"/>
             <w:shd w:fill="F8FAFC"/>
-            <w:tcMar>
-              <w:top w:w="80" w:type="dxa"/>
-              <w:bottom w:w="80" w:type="dxa"/>
-              <w:left w:w="120" w:type="dxa"/>
-              <w:right w:w="120" w:type="dxa"/>
-            </w:tcMar>
-            <w:shd w:fill="F8FAFC"/>
-            <w:tcMar>
-              <w:top w:w="70" w:type="dxa"/>
-              <w:bottom w:w="70" w:type="dxa"/>
-              <w:left w:w="120" w:type="dxa"/>
-              <w:right w:w="120" w:type="dxa"/>
-            </w:tcMar>
-            <w:vAlign w:val="center"/>
-          </w:tcPr>
-          <w:p>
-            <w:pPr>
-              <w:spacing w:line="252" w:lineRule="auto" w:before="0" w:after="0"/>
-              <w:jc w:val="left"/>
-            </w:pPr>
-            <w:r>
-              <w:rPr>
-                <w:rFonts w:ascii="Arial" w:hAnsi="Arial"/>
-                <w:color w:val="1E293B"/>
+          </w:tcPr>
+          <w:p>
+            <w:pPr>
+              <w:spacing w:line="264" w:lineRule="auto" w:before="40" w:after="40"/>
+              <w:jc w:val="left"/>
+            </w:pPr>
+            <w:r/>
+            <w:r>
+              <w:rPr>
+                <w:rFonts w:ascii="Arial" w:hAnsi="Arial"/>
+                <w:b w:val="0"/>
+                <w:color w:val="334155"/>
                 <w:sz w:val="18"/>
               </w:rPr>
-              <w:t>CU-01.2: Registrar Nueva Gestión con Activación de Tubo de Trabajo</w:t>
+              <w:t>CU-02.1: Visualizar y Transicionar Estados en Tablero Kanban</w:t>
             </w:r>
           </w:p>
         </w:tc>
@@ -18124,30 +18347,19 @@
         </w:trPr>
         <w:tc>
           <w:tcPr>
-            <w:tcW w:type="dxa" w:w="4680"/>
-            <w:tcMar>
-              <w:top w:w="80" w:type="dxa"/>
-              <w:bottom w:w="80" w:type="dxa"/>
-              <w:left w:w="120" w:type="dxa"/>
-              <w:right w:w="120" w:type="dxa"/>
-            </w:tcMar>
+            <w:tcW w:type="dxa" w:w="2880"/>
             <w:shd w:fill="FFFFFF"/>
-            <w:tcMar>
-              <w:top w:w="70" w:type="dxa"/>
-              <w:bottom w:w="70" w:type="dxa"/>
-              <w:left w:w="120" w:type="dxa"/>
-              <w:right w:w="120" w:type="dxa"/>
-            </w:tcMar>
-            <w:vAlign w:val="center"/>
-          </w:tcPr>
-          <w:p>
-            <w:pPr>
-              <w:spacing w:line="252" w:lineRule="auto" w:before="0" w:after="0"/>
-              <w:jc w:val="left"/>
-            </w:pPr>
-            <w:r>
-              <w:rPr>
-                <w:rFonts w:ascii="Arial" w:hAnsi="Arial"/>
+          </w:tcPr>
+          <w:p>
+            <w:pPr>
+              <w:spacing w:line="264" w:lineRule="auto" w:before="40" w:after="40"/>
+              <w:jc w:val="left"/>
+            </w:pPr>
+            <w:r/>
+            <w:r>
+              <w:rPr>
+                <w:rFonts w:ascii="Arial" w:hAnsi="Arial"/>
+                <w:b/>
                 <w:color w:val="1E293B"/>
                 <w:sz w:val="18"/>
               </w:rPr>
@@ -18157,34 +18369,23 @@
         </w:tc>
         <w:tc>
           <w:tcPr>
-            <w:tcW w:type="dxa" w:w="4680"/>
-            <w:tcMar>
-              <w:top w:w="80" w:type="dxa"/>
-              <w:bottom w:w="80" w:type="dxa"/>
-              <w:left w:w="120" w:type="dxa"/>
-              <w:right w:w="120" w:type="dxa"/>
-            </w:tcMar>
+            <w:tcW w:type="dxa" w:w="6912"/>
             <w:shd w:fill="FFFFFF"/>
-            <w:tcMar>
-              <w:top w:w="70" w:type="dxa"/>
-              <w:bottom w:w="70" w:type="dxa"/>
-              <w:left w:w="120" w:type="dxa"/>
-              <w:right w:w="120" w:type="dxa"/>
-            </w:tcMar>
-            <w:vAlign w:val="center"/>
-          </w:tcPr>
-          <w:p>
-            <w:pPr>
-              <w:spacing w:line="252" w:lineRule="auto" w:before="0" w:after="0"/>
-              <w:jc w:val="left"/>
-            </w:pPr>
-            <w:r>
-              <w:rPr>
-                <w:rFonts w:ascii="Arial" w:hAnsi="Arial"/>
-                <w:color w:val="1E293B"/>
+          </w:tcPr>
+          <w:p>
+            <w:pPr>
+              <w:spacing w:line="264" w:lineRule="auto" w:before="40" w:after="40"/>
+              <w:jc w:val="left"/>
+            </w:pPr>
+            <w:r/>
+            <w:r>
+              <w:rPr>
+                <w:rFonts w:ascii="Arial" w:hAnsi="Arial"/>
+                <w:b w:val="0"/>
+                <w:color w:val="334155"/>
                 <w:sz w:val="18"/>
               </w:rPr>
-              <w:t>Funcionario / Operador Territorial (iniciador), Delegado Municipal (iniciador).</w:t>
+              <w:t>Delegado Municipal (iniciador), Coordinador Comunal (iniciador), Funcionario Responsable.</w:t>
             </w:r>
           </w:p>
         </w:tc>
@@ -18195,74 +18396,47 @@
         </w:trPr>
         <w:tc>
           <w:tcPr>
-            <w:tcW w:type="dxa" w:w="4680"/>
+            <w:tcW w:type="dxa" w:w="2880"/>
             <w:shd w:fill="F8FAFC"/>
-            <w:tcMar>
-              <w:top w:w="80" w:type="dxa"/>
-              <w:bottom w:w="80" w:type="dxa"/>
-              <w:left w:w="120" w:type="dxa"/>
-              <w:right w:w="120" w:type="dxa"/>
-            </w:tcMar>
-            <w:shd w:fill="F8FAFC"/>
-            <w:tcMar>
-              <w:top w:w="70" w:type="dxa"/>
-              <w:bottom w:w="70" w:type="dxa"/>
-              <w:left w:w="120" w:type="dxa"/>
-              <w:right w:w="120" w:type="dxa"/>
-            </w:tcMar>
-            <w:vAlign w:val="center"/>
-          </w:tcPr>
-          <w:p>
-            <w:pPr>
-              <w:spacing w:line="252" w:lineRule="auto" w:before="0" w:after="0"/>
-              <w:jc w:val="left"/>
-            </w:pPr>
+          </w:tcPr>
+          <w:p>
+            <w:pPr>
+              <w:spacing w:line="264" w:lineRule="auto" w:before="40" w:after="40"/>
+              <w:jc w:val="left"/>
+            </w:pPr>
+            <w:r/>
             <w:r>
               <w:rPr>
                 <w:rFonts w:ascii="Arial" w:hAnsi="Arial"/>
                 <w:b/>
-                <w:color w:val="1E3A8A"/>
-                <w:sz w:val="18"/>
-              </w:rPr>
-              <w:t>Precondiciones</w:t>
-            </w:r>
-          </w:p>
-        </w:tc>
-        <w:tc>
-          <w:tcPr>
-            <w:tcW w:type="dxa" w:w="4680"/>
-            <w:shd w:fill="F8FAFC"/>
-            <w:tcMar>
-              <w:top w:w="80" w:type="dxa"/>
-              <w:bottom w:w="80" w:type="dxa"/>
-              <w:left w:w="120" w:type="dxa"/>
-              <w:right w:w="120" w:type="dxa"/>
-            </w:tcMar>
-            <w:shd w:fill="F8FAFC"/>
-            <w:tcMar>
-              <w:top w:w="70" w:type="dxa"/>
-              <w:bottom w:w="70" w:type="dxa"/>
-              <w:left w:w="120" w:type="dxa"/>
-              <w:right w:w="120" w:type="dxa"/>
-            </w:tcMar>
-            <w:vAlign w:val="center"/>
-          </w:tcPr>
-          <w:p>
-            <w:pPr>
-              <w:spacing w:line="252" w:lineRule="auto" w:before="0" w:after="0"/>
-              <w:jc w:val="left"/>
-            </w:pPr>
-            <w:r>
-              <w:rPr>
-                <w:rFonts w:ascii="Arial" w:hAnsi="Arial"/>
                 <w:color w:val="1E293B"/>
                 <w:sz w:val="18"/>
               </w:rPr>
-              <w:t>1. Funcionario autenticado en sesión activa.</w:t>
+              <w:t>Precondiciones</w:t>
+            </w:r>
+          </w:p>
+        </w:tc>
+        <w:tc>
+          <w:tcPr>
+            <w:tcW w:type="dxa" w:w="6912"/>
+            <w:shd w:fill="F8FAFC"/>
+          </w:tcPr>
+          <w:p>
+            <w:pPr>
+              <w:spacing w:line="264" w:lineRule="auto" w:before="40" w:after="40"/>
+              <w:jc w:val="left"/>
+            </w:pPr>
+            <w:r/>
+            <w:r>
+              <w:rPr>
+                <w:rFonts w:ascii="Arial" w:hAnsi="Arial"/>
+                <w:b w:val="0"/>
+                <w:color w:val="334155"/>
+                <w:sz w:val="18"/>
+              </w:rPr>
+              <w:t>1. Usuario autenticado con rol autorizado para la delegación.</w:t>
               <w:br/>
-              <w:t>2. Delegación territorial asignada.</w:t>
-              <w:br/>
-              <w:t>3. Catálogos temáticos y funcionarios activos.</w:t>
+              <w:t>2. Existencia de compromisos registrados en la tabla 'compromisos_tubo'.</w:t>
             </w:r>
           </w:p>
         </w:tc>
@@ -18273,30 +18447,19 @@
         </w:trPr>
         <w:tc>
           <w:tcPr>
-            <w:tcW w:type="dxa" w:w="4680"/>
-            <w:tcMar>
-              <w:top w:w="80" w:type="dxa"/>
-              <w:bottom w:w="80" w:type="dxa"/>
-              <w:left w:w="120" w:type="dxa"/>
-              <w:right w:w="120" w:type="dxa"/>
-            </w:tcMar>
+            <w:tcW w:type="dxa" w:w="2880"/>
             <w:shd w:fill="FFFFFF"/>
-            <w:tcMar>
-              <w:top w:w="70" w:type="dxa"/>
-              <w:bottom w:w="70" w:type="dxa"/>
-              <w:left w:w="120" w:type="dxa"/>
-              <w:right w:w="120" w:type="dxa"/>
-            </w:tcMar>
-            <w:vAlign w:val="center"/>
-          </w:tcPr>
-          <w:p>
-            <w:pPr>
-              <w:spacing w:line="252" w:lineRule="auto" w:before="0" w:after="0"/>
-              <w:jc w:val="left"/>
-            </w:pPr>
-            <w:r>
-              <w:rPr>
-                <w:rFonts w:ascii="Arial" w:hAnsi="Arial"/>
+          </w:tcPr>
+          <w:p>
+            <w:pPr>
+              <w:spacing w:line="264" w:lineRule="auto" w:before="40" w:after="40"/>
+              <w:jc w:val="left"/>
+            </w:pPr>
+            <w:r/>
+            <w:r>
+              <w:rPr>
+                <w:rFonts w:ascii="Arial" w:hAnsi="Arial"/>
+                <w:b/>
                 <w:color w:val="1E293B"/>
                 <w:sz w:val="18"/>
               </w:rPr>
@@ -18306,52 +18469,37 @@
         </w:tc>
         <w:tc>
           <w:tcPr>
-            <w:tcW w:type="dxa" w:w="4680"/>
-            <w:tcMar>
-              <w:top w:w="80" w:type="dxa"/>
-              <w:bottom w:w="80" w:type="dxa"/>
-              <w:left w:w="120" w:type="dxa"/>
-              <w:right w:w="120" w:type="dxa"/>
-            </w:tcMar>
+            <w:tcW w:type="dxa" w:w="6912"/>
             <w:shd w:fill="FFFFFF"/>
-            <w:tcMar>
-              <w:top w:w="70" w:type="dxa"/>
-              <w:bottom w:w="70" w:type="dxa"/>
-              <w:left w:w="120" w:type="dxa"/>
-              <w:right w:w="120" w:type="dxa"/>
-            </w:tcMar>
-            <w:vAlign w:val="center"/>
-          </w:tcPr>
-          <w:p>
-            <w:pPr>
-              <w:spacing w:line="252" w:lineRule="auto" w:before="0" w:after="0"/>
-              <w:jc w:val="left"/>
-            </w:pPr>
-            <w:r>
-              <w:rPr>
-                <w:rFonts w:ascii="Arial" w:hAnsi="Arial"/>
-                <w:color w:val="1E293B"/>
+          </w:tcPr>
+          <w:p>
+            <w:pPr>
+              <w:spacing w:line="264" w:lineRule="auto" w:before="40" w:after="40"/>
+              <w:jc w:val="left"/>
+            </w:pPr>
+            <w:r/>
+            <w:r>
+              <w:rPr>
+                <w:rFonts w:ascii="Arial" w:hAnsi="Arial"/>
+                <w:b w:val="0"/>
+                <w:color w:val="334155"/>
                 <w:sz w:val="18"/>
               </w:rPr>
-              <w:t>1. El actor ingresa a Gestiones ➜ Nueva Gestión (/actividades/nueva/).</w:t>
+              <w:t>1. El actor ingresa al módulo 'Tubo de Trabajo' (/agenda/resumen/).</w:t>
               <w:br/>
-              <w:t>2. El sistema despliega el formulario unificado con fecha actual y código sugerido GES-XXXXX.</w:t>
+              <w:t>2. El sistema consulta MySQL y agrupa los compromisos de la delegación en 4 columnas según su estado.</w:t>
               <w:br/>
-              <w:t>3. El actor ingresa datos del solicitante (nombre, RUT, teléfono, dirección y territorio).</w:t>
+              <w:t>3. El sistema renderiza el tablero visual desplegando el contador total de tarjetas por columna en tiempo real.</w:t>
               <w:br/>
-              <w:t>4. El actor selecciona Tipo de Atención; el sistema carga asíncronamente (AJAX) las SubAtenciones.</w:t>
+              <w:t>4. Cada tarjeta visualiza: Folio TUB-XXXXX, insignia de gestión origen [GES/SOC], nombre del vecino, territorio y área de apoyo.</w:t>
               <w:br/>
-              <w:t>5. El actor ingresa la solicitud y la acción realizada.</w:t>
+              <w:t>5. El actor presiona el botón de transición rápida de estado (ej: '✓ Realizar' o '➜ En Proceso').</w:t>
               <w:br/>
-              <w:t>6. El actor activa el switch '¿Derivar al Tubo de Trabajo? = SÍ'.</w:t>
+              <w:t>6. El sistema envía petición asíncrona al endpoint /agenda/cambiar-estado/&lt;id&gt;/&lt;NUEVO_ESTADO&gt;/.</w:t>
               <w:br/>
-              <w:t>7. El sistema despliega dinámicamente la sección del Tubo solicitando fecha límite, área de apoyo y territorio.</w:t>
+              <w:t>7. El sistema actualiza el registro en 'compromisos_tubo' y actualiza sincrónicamente el estado de la actividad madre vinculada.</w:t>
               <w:br/>
-              <w:t>8. El actor presiona 'Guardar Gestión y Generar Folio Oficial'.</w:t>
-              <w:br/>
-              <w:t>9. El sistema inicia transacción atómica, inserta en 'actividades', genera compromiso correlativo 'TUB-XXXXX' con id_actividad vinculado y código de evidencia 'EVI-YYYYMMDD-XXXX'.</w:t>
-              <w:br/>
-              <w:t>10. El sistema redirige al Libro General de Gestiones confirmando con SweetAlert2.</w:t>
+              <w:t>8. La tarjeta transiciona a la columna de destino con animación visual de éxito y se actualizan los contadores.</w:t>
             </w:r>
           </w:p>
         </w:tc>
@@ -18362,31 +18510,19 @@
         </w:trPr>
         <w:tc>
           <w:tcPr>
-            <w:tcW w:type="dxa" w:w="4680"/>
+            <w:tcW w:type="dxa" w:w="2880"/>
             <w:shd w:fill="F8FAFC"/>
-            <w:tcMar>
-              <w:top w:w="80" w:type="dxa"/>
-              <w:bottom w:w="80" w:type="dxa"/>
-              <w:left w:w="120" w:type="dxa"/>
-              <w:right w:w="120" w:type="dxa"/>
-            </w:tcMar>
-            <w:shd w:fill="F8FAFC"/>
-            <w:tcMar>
-              <w:top w:w="70" w:type="dxa"/>
-              <w:bottom w:w="70" w:type="dxa"/>
-              <w:left w:w="120" w:type="dxa"/>
-              <w:right w:w="120" w:type="dxa"/>
-            </w:tcMar>
-            <w:vAlign w:val="center"/>
-          </w:tcPr>
-          <w:p>
-            <w:pPr>
-              <w:spacing w:line="252" w:lineRule="auto" w:before="0" w:after="0"/>
-              <w:jc w:val="left"/>
-            </w:pPr>
-            <w:r>
-              <w:rPr>
-                <w:rFonts w:ascii="Arial" w:hAnsi="Arial"/>
+          </w:tcPr>
+          <w:p>
+            <w:pPr>
+              <w:spacing w:line="264" w:lineRule="auto" w:before="40" w:after="40"/>
+              <w:jc w:val="left"/>
+            </w:pPr>
+            <w:r/>
+            <w:r>
+              <w:rPr>
+                <w:rFonts w:ascii="Arial" w:hAnsi="Arial"/>
+                <w:b/>
                 <w:color w:val="1E293B"/>
                 <w:sz w:val="18"/>
               </w:rPr>
@@ -18396,37 +18532,25 @@
         </w:tc>
         <w:tc>
           <w:tcPr>
-            <w:tcW w:type="dxa" w:w="4680"/>
+            <w:tcW w:type="dxa" w:w="6912"/>
             <w:shd w:fill="F8FAFC"/>
-            <w:tcMar>
-              <w:top w:w="80" w:type="dxa"/>
-              <w:bottom w:w="80" w:type="dxa"/>
-              <w:left w:w="120" w:type="dxa"/>
-              <w:right w:w="120" w:type="dxa"/>
-            </w:tcMar>
-            <w:shd w:fill="F8FAFC"/>
-            <w:tcMar>
-              <w:top w:w="70" w:type="dxa"/>
-              <w:bottom w:w="70" w:type="dxa"/>
-              <w:left w:w="120" w:type="dxa"/>
-              <w:right w:w="120" w:type="dxa"/>
-            </w:tcMar>
-            <w:vAlign w:val="center"/>
-          </w:tcPr>
-          <w:p>
-            <w:pPr>
-              <w:spacing w:line="252" w:lineRule="auto" w:before="0" w:after="0"/>
-              <w:jc w:val="left"/>
-            </w:pPr>
-            <w:r>
-              <w:rPr>
-                <w:rFonts w:ascii="Arial" w:hAnsi="Arial"/>
-                <w:color w:val="1E293B"/>
+          </w:tcPr>
+          <w:p>
+            <w:pPr>
+              <w:spacing w:line="264" w:lineRule="auto" w:before="40" w:after="40"/>
+              <w:jc w:val="left"/>
+            </w:pPr>
+            <w:r/>
+            <w:r>
+              <w:rPr>
+                <w:rFonts w:ascii="Arial" w:hAnsi="Arial"/>
+                <w:b w:val="0"/>
+                <w:color w:val="334155"/>
                 <w:sz w:val="18"/>
               </w:rPr>
-              <w:t>A1. Caso Social Especializado: Si activa '¿Es Gestión Social?', el prefijo cambia a SOC-XXXXX y se despliega la ficha multi-etapa (Visitas, FIBE, Beneficios).</w:t>
+              <w:t>A1. Compromiso Autónomo Directo: Si el compromiso fue registrado directamente sin gestión madre previa, opera con normalidad omitiendo la insignia [GES].</w:t>
               <w:br/>
-              <w:t>A2. Campos obligatorios incompletos: El sistema bloquea el envío y resalta campos en rojo.</w:t>
+              <w:t>A2. Restricción por Delegación: Si un usuario intenta modificar compromisos ajenos a su territorio asignado, el sistema bloquea la acción con HTTP 403 Forbidden.</w:t>
             </w:r>
           </w:p>
         </w:tc>
@@ -18437,68 +18561,45 @@
         </w:trPr>
         <w:tc>
           <w:tcPr>
-            <w:tcW w:type="dxa" w:w="4680"/>
-            <w:tcMar>
-              <w:top w:w="80" w:type="dxa"/>
-              <w:bottom w:w="80" w:type="dxa"/>
-              <w:left w:w="120" w:type="dxa"/>
-              <w:right w:w="120" w:type="dxa"/>
-            </w:tcMar>
+            <w:tcW w:type="dxa" w:w="2880"/>
             <w:shd w:fill="FFFFFF"/>
-            <w:tcMar>
-              <w:top w:w="70" w:type="dxa"/>
-              <w:bottom w:w="70" w:type="dxa"/>
-              <w:left w:w="120" w:type="dxa"/>
-              <w:right w:w="120" w:type="dxa"/>
-            </w:tcMar>
-            <w:vAlign w:val="center"/>
-          </w:tcPr>
-          <w:p>
-            <w:pPr>
-              <w:spacing w:line="252" w:lineRule="auto" w:before="0" w:after="0"/>
-              <w:jc w:val="left"/>
-            </w:pPr>
+          </w:tcPr>
+          <w:p>
+            <w:pPr>
+              <w:spacing w:line="264" w:lineRule="auto" w:before="40" w:after="40"/>
+              <w:jc w:val="left"/>
+            </w:pPr>
+            <w:r/>
             <w:r>
               <w:rPr>
                 <w:rFonts w:ascii="Arial" w:hAnsi="Arial"/>
                 <w:b/>
-                <w:color w:val="1E3A8A"/>
-                <w:sz w:val="18"/>
-              </w:rPr>
-              <w:t>Postcondiciones</w:t>
-            </w:r>
-          </w:p>
-        </w:tc>
-        <w:tc>
-          <w:tcPr>
-            <w:tcW w:type="dxa" w:w="4680"/>
-            <w:tcMar>
-              <w:top w:w="80" w:type="dxa"/>
-              <w:bottom w:w="80" w:type="dxa"/>
-              <w:left w:w="120" w:type="dxa"/>
-              <w:right w:w="120" w:type="dxa"/>
-            </w:tcMar>
-            <w:shd w:fill="FFFFFF"/>
-            <w:tcMar>
-              <w:top w:w="70" w:type="dxa"/>
-              <w:bottom w:w="70" w:type="dxa"/>
-              <w:left w:w="120" w:type="dxa"/>
-              <w:right w:w="120" w:type="dxa"/>
-            </w:tcMar>
-            <w:vAlign w:val="center"/>
-          </w:tcPr>
-          <w:p>
-            <w:pPr>
-              <w:spacing w:line="252" w:lineRule="auto" w:before="0" w:after="0"/>
-              <w:jc w:val="left"/>
-            </w:pPr>
-            <w:r>
-              <w:rPr>
-                <w:rFonts w:ascii="Arial" w:hAnsi="Arial"/>
                 <w:color w:val="1E293B"/>
                 <w:sz w:val="18"/>
               </w:rPr>
-              <w:t>La gestión se consolida en el Libro General y la tarjeta aparece de inmediato en la columna 'Ingresados / Pendientes' del Tablero Kanban del Tubo.</w:t>
+              <w:t>Postcondiciones</w:t>
+            </w:r>
+          </w:p>
+        </w:tc>
+        <w:tc>
+          <w:tcPr>
+            <w:tcW w:type="dxa" w:w="6912"/>
+            <w:shd w:fill="FFFFFF"/>
+          </w:tcPr>
+          <w:p>
+            <w:pPr>
+              <w:spacing w:line="264" w:lineRule="auto" w:before="40" w:after="40"/>
+              <w:jc w:val="left"/>
+            </w:pPr>
+            <w:r/>
+            <w:r>
+              <w:rPr>
+                <w:rFonts w:ascii="Arial" w:hAnsi="Arial"/>
+                <w:b w:val="0"/>
+                <w:color w:val="334155"/>
+                <w:sz w:val="18"/>
+              </w:rPr>
+              <w:t>El compromiso queda actualizado en base de datos y computa automáticamente en el módulo de Resultados y Metas SGR.</w:t>
             </w:r>
           </w:p>
         </w:tc>
@@ -18506,129 +18607,40 @@
     </w:tbl>
     <w:p>
       <w:pPr>
-        <w:spacing w:line="276" w:lineRule="auto" w:before="0" w:after="120"/>
+        <w:spacing w:line="276" w:lineRule="auto" w:after="120" w:before="120"/>
         <w:jc w:val="both"/>
       </w:pPr>
       <w:r>
         <w:rPr>
           <w:rFonts w:ascii="Arial" w:hAnsi="Arial"/>
-          <w:i/>
+          <w:b/>
           <w:color w:val="1E293B"/>
           <w:sz w:val="22"/>
         </w:rPr>
-        <w:t>Blueprint Estructural del Wireframe A (Formulario Unificado /actividades/nueva/):</w:t>
-        <w:br/>
-        <w:t>El siguiente esquema representa la distribución espacial, los bloques funcionales y las llamadas de interacción:</w:t>
+        <w:t xml:space="preserve">5. Wireframe (Front-End): </w:t>
+      </w:r>
+      <w:r>
+        <w:rPr>
+          <w:rFonts w:ascii="Arial" w:hAnsi="Arial"/>
+          <w:color w:val="334155"/>
+          <w:sz w:val="22"/>
+        </w:rPr>
+        <w:t>A continuación se presenta el Wireframe Front-End implementado en la plataforma web que materializa el Caso de Uso CU-02.1 y el Requerimiento Funcional RF-017:</w:t>
       </w:r>
     </w:p>
     <w:p>
       <w:pPr>
-        <w:spacing w:line="240" w:lineRule="auto" w:before="80" w:after="160"/>
-        <w:jc w:val="left"/>
-      </w:pPr>
-      <w:r>
-        <w:rPr>
-          <w:rFonts w:ascii="Consolas" w:hAnsi="Consolas"/>
-          <w:color w:val="1E293B"/>
-          <w:sz w:val="15"/>
-        </w:rPr>
-        <w:t>┌─────────────────────────────────────────────────────────────────────────────────────────────┐</w:t>
-        <w:br/>
-        <w:t>│ MUNICIPALIDAD DE LA SERENA — SGR                👤 Juan Pérez [Las Compañías Alta]  [Salir] │</w:t>
-        <w:br/>
-        <w:t>├─────────────────────────────────────────────────────────────────────────────────────────────┤</w:t>
-        <w:br/>
-        <w:t>│ [ Inicio ]   [ Gestiones ▼ ]   [ Tubo de Trabajo ]   [ Mantenedores ▼ ]   [ Resultados ]    │</w:t>
-        <w:br/>
-        <w:t>├─────────────────────────────────────────────────────────────────────────────────────────────┤</w:t>
-        <w:br/>
-        <w:t>│ FORMULARIO UNIFICADO DE REGISTRO DE GESTIÓN (RF-016 / CU-01.2)                              │</w:t>
-        <w:br/>
-        <w:t>│                                                                                             │</w:t>
-        <w:br/>
-        <w:t>│ ┌─ [1] ENCABEZADO DE AUDITORÍA ───────────────────────────────────────────────────────────┐ │</w:t>
-        <w:br/>
-        <w:t>│ │ Delegación: [DEL-01] Las Compañías Alta    │ Folio Sugerido: [ GES-00028 ]              │ │</w:t>
-        <w:br/>
-        <w:t>│ │ Fecha:      [ 22/10/2026 ]                 │ Código Evidencia: [ EVI-20261022-0028 ]    │ │</w:t>
-        <w:br/>
-        <w:t>│ └─────────────────────────────────────────────────────────────────────────────────────────┘ │</w:t>
-        <w:br/>
-        <w:t>│                                                                                             │</w:t>
-        <w:br/>
-        <w:t>│ ┌─ [2] DATOS DEL VECINO / SOLICITANTE ────────────────────────────────────────────────────┐ │</w:t>
-        <w:br/>
-        <w:t>│ │ Nombre (*): [ Roberto Carlos Valenzuela Araya      ] RUT: [ 12.345.678-9 ]              │ │</w:t>
-        <w:br/>
-        <w:t>│ │ Teléfono:   [ +56 9 8765 4321 ]     Correo:   [ rvalenzuela@vecino.cl                  ]│ │</w:t>
-        <w:br/>
-        <w:t>│ │ Dirección:  [ Pasaje Las Rosas #450, Villa El Brillador                                ]│ │</w:t>
-        <w:br/>
-        <w:t>│ │ Territorio: [ Las Compañías Alta - Sector El Salitre                                   ]│ │</w:t>
-        <w:br/>
-        <w:t>│ └─────────────────────────────────────────────────────────────────────────────────────────┘ │</w:t>
-        <w:br/>
-        <w:t>│                                                                                             │</w:t>
-        <w:br/>
-        <w:t>│ ┌─ [3] CLASIFICACIÓN TEMÁTICA EN CASCADA (AJAX) ──────────────────────────────────────────┐ │</w:t>
-        <w:br/>
-        <w:t>│ │ Tipo Atención (*): [ Infraestructura y Espacios Públicos (TIP-02)                     ▼]│ │</w:t>
-        <w:br/>
-        <w:t>│ │ Sub Atención (*):  [ Bacheo y Pavimentación Participativa (SUB-04)                   ▼]│ │</w:t>
-        <w:br/>
-        <w:t>│ │ Responsable (*):   [ Acuaman (Encargado Operaciones)                                  ▼]│ │</w:t>
-        <w:br/>
-        <w:t>│ └─────────────────────────────────────────────────────────────────────────────────────────┘ │</w:t>
-        <w:br/>
-        <w:t>│                                                                                             │</w:t>
-        <w:br/>
-        <w:t>│ ┌─ [4] REQUERIMIENTO Y RESPUESTA MUNICIPAL ───────────────────────────────────────────────┐ │</w:t>
-        <w:br/>
-        <w:t>│ │ Solicitud (*): [ Vecinos reportan socavón en calzada por rotura de matriz. Peligro vial ]│ │</w:t>
-        <w:br/>
-        <w:t>│ │ Acción (*):    [ Inspección técnica en terreno con presidente de Junta de Vecinos       ]│ │</w:t>
-        <w:br/>
-        <w:t>│ └─────────────────────────────────────────────────────────────────────────────────────────┘ │</w:t>
-        <w:br/>
-        <w:t>│                                                                                             │</w:t>
-        <w:br/>
-        <w:t>│ ┌─ [5] SECCIÓN REACTIVA: TUBO DE TRABAJO (SEGUIMIENTO INTERSECTORIAL) ────────────────────┐ │</w:t>
-        <w:br/>
-        <w:t>│ │ [X] ¿MANDAR AL MÉTODO DE TUBO DE TRABAJO? (Derivación coordinada entre unidades)        │ │</w:t>
-        <w:br/>
-        <w:t>│ │ ┌─────────────────────────────────────────────────────────────────────────────────────┐ │ │</w:t>
-        <w:br/>
-        <w:t>│ │ │ Fecha Comprometida (*): [ 15/11/2026 ]   Área de Apoyo (*): [ Dirección de Tránsito ]│ │ │</w:t>
-        <w:br/>
-        <w:t>│ │ │ Territorio Específico:  [ Sector El Salitre - Eje Central                           ]│ │ │</w:t>
-        <w:br/>
-        <w:t>│ │ │ ℹ️ Se creará una tarjeta con código TUB-XXXXX visible en el Tablero Kanban.         │ │ │</w:t>
-        <w:br/>
-        <w:t>│ │ └─────────────────────────────────────────────────────────────────────────────────────┘ │ │</w:t>
-        <w:br/>
-        <w:t>│ └─────────────────────────────────────────────────────────────────────────────────────────┘ │</w:t>
-        <w:br/>
-        <w:t>│                                                                                             │</w:t>
-        <w:br/>
-        <w:t>│ [ Cancelar ]                                 [ 💾 GUARDAR GESTIÓN Y GENERAR FOLIO OFICIAL ] │</w:t>
-        <w:br/>
-        <w:t>└─────────────────────────────────────────────────────────────────────────────────────────────┘</w:t>
-      </w:r>
-    </w:p>
-    <w:p>
-      <w:pPr>
-        <w:pStyle w:val="Heading3"/>
-        <w:spacing w:before="200" w:after="60"/>
-        <w:jc w:val="left"/>
+        <w:spacing w:line="276" w:lineRule="auto" w:after="60" w:before="120"/>
+        <w:jc w:val="center"/>
       </w:pPr>
       <w:r>
         <w:rPr>
           <w:rFonts w:ascii="Arial" w:hAnsi="Arial"/>
           <w:b/>
-          <w:color w:val="334155"/>
-          <w:sz w:val="22"/>
+          <w:color w:val="0F172A"/>
+          <w:sz w:val="21"/>
         </w:rPr>
-        <w:t>3.7.2 Flujo B: Tablero Kanban del Tubo de Trabajo (Seguimiento Intersectorial)</w:t>
+        <w:t>Figura 2: Wireframe Front-End — Tablero Kanban del Tubo de Trabajo (4 Columnas de Seguimiento)</w:t>
       </w:r>
     </w:p>
     <w:tbl>
@@ -18636,6 +18648,220 @@
         <w:tblW w:type="auto" w:w="0"/>
         <w:jc w:val="center"/>
         <w:tblLook w:firstColumn="1" w:firstRow="1" w:lastColumn="0" w:lastRow="0" w:noHBand="0" w:noVBand="1" w:val="04A0"/>
+        <w:tblBorders>
+          <w:top w:val="dashed" w:sz="8" w:space="0" w:color="94A3B8"/>
+          <w:bottom w:val="dashed" w:sz="8" w:space="0" w:color="94A3B8"/>
+          <w:left w:val="dashed" w:sz="8" w:space="0" w:color="94A3B8"/>
+          <w:right w:val="dashed" w:sz="8" w:space="0" w:color="94A3B8"/>
+          <w:insideH w:val="none"/>
+          <w:insideV w:val="none"/>
+        </w:tblBorders>
+      </w:tblPr>
+      <w:tblGrid>
+        <w:gridCol w:w="9360"/>
+      </w:tblGrid>
+      <w:tr>
+        <w:trPr>
+          <w:cantSplit/>
+        </w:trPr>
+        <w:tc>
+          <w:tcPr>
+            <w:tcW w:type="dxa" w:w="9792"/>
+            <w:shd w:fill="F8FAFC"/>
+          </w:tcPr>
+          <w:p>
+            <w:pPr>
+              <w:spacing w:line="300" w:lineRule="auto" w:before="560" w:after="560"/>
+              <w:jc w:val="center"/>
+            </w:pPr>
+            <w:r/>
+            <w:r>
+              <w:rPr>
+                <w:rFonts w:ascii="Arial" w:hAnsi="Arial"/>
+                <w:b/>
+                <w:color w:val="2563EB"/>
+                <w:sz w:val="23"/>
+              </w:rPr>
+              <w:t>📷 [ PEGAR AQUÍ CAPTURA DE PANTALLA / WIREFRAME FRONT-END ]</w:t>
+              <w:br/>
+            </w:r>
+            <w:r>
+              <w:rPr>
+                <w:rFonts w:ascii="Arial" w:hAnsi="Arial"/>
+                <w:b/>
+                <w:color w:val="1E293B"/>
+                <w:sz w:val="20"/>
+              </w:rPr>
+              <w:t>Pantalla: Tablero Kanban del Tubo de Trabajo (4 Columnas de Seguimiento)</w:t>
+              <w:br/>
+            </w:r>
+            <w:r>
+              <w:rPr>
+                <w:rFonts w:ascii="Consolas" w:hAnsi="Consolas"/>
+                <w:color w:val="0F766E"/>
+                <w:sz w:val="19"/>
+              </w:rPr>
+              <w:t>URL de Acceso en Servidor Cloud: http://3.229.11.31/agenda/resumen/</w:t>
+              <w:br/>
+            </w:r>
+            <w:r>
+              <w:rPr>
+                <w:rFonts w:ascii="Arial" w:hAnsi="Arial"/>
+                <w:color w:val="64748B"/>
+                <w:sz w:val="18"/>
+              </w:rPr>
+              <w:t>Usuario de Prueba: delegado_compa | Contraseña: pass1234</w:t>
+              <w:br/>
+              <w:br/>
+            </w:r>
+            <w:r>
+              <w:rPr>
+                <w:rFonts w:ascii="Arial" w:hAnsi="Arial"/>
+                <w:i/>
+                <w:color w:val="94A3B8"/>
+                <w:sz w:val="17"/>
+              </w:rPr>
+              <w:t>(Haz clic en este recuadro y presiona Ctrl+V para pegar directamente el pantallazo tomado desde el navegador)</w:t>
+            </w:r>
+          </w:p>
+        </w:tc>
+      </w:tr>
+    </w:tbl>
+    <w:p>
+      <w:pPr>
+        <w:spacing w:line="276" w:lineRule="auto" w:after="200" w:before="80"/>
+        <w:jc w:val="both"/>
+      </w:pPr>
+      <w:r>
+        <w:rPr>
+          <w:rFonts w:ascii="Arial" w:hAnsi="Arial"/>
+          <w:i/>
+          <w:color w:val="475569"/>
+          <w:sz w:val="19"/>
+        </w:rPr>
+        <w:t>Componentes Clave a Visualizar en la Interfaz: Barra superior con selector de delegación territorial y botón de nuevo compromiso; 4 Columnas Kanban con contadores dinámicos (Ingresados [Azul], Pendientes [Ámbar], En Proceso [Púrpura], Realizados [Verde]); Tarjetas de compromiso con código TUB-XXXXX, badge con enlace a la gestión madre [GES-XXXXX], solicitante, territorio, fecha límite y botones de transición directa en un clic.</w:t>
+      </w:r>
+    </w:p>
+    <w:p>
+      <w:pPr>
+        <w:pStyle w:val="Heading3"/>
+        <w:spacing w:before="280" w:after="80"/>
+      </w:pPr>
+      <w:r>
+        <w:rPr>
+          <w:rFonts w:ascii="Arial" w:hAnsi="Arial"/>
+          <w:b/>
+          <w:color w:val="1E293B"/>
+          <w:sz w:val="22"/>
+        </w:rPr>
+        <w:t>3.7.3 Flujo Operativo 3: Tablero Comunal de Resultados y Semáforo de Desempeño SGR</w:t>
+      </w:r>
+    </w:p>
+    <w:p>
+      <w:pPr>
+        <w:spacing w:line="276" w:lineRule="auto" w:after="120" w:before="0"/>
+        <w:jc w:val="both"/>
+      </w:pPr>
+      <w:r>
+        <w:rPr>
+          <w:rFonts w:ascii="Arial" w:hAnsi="Arial"/>
+          <w:b/>
+          <w:color w:val="1E293B"/>
+          <w:sz w:val="22"/>
+        </w:rPr>
+        <w:t xml:space="preserve">1. Requerimiento Funcional (RF): </w:t>
+      </w:r>
+      <w:r>
+        <w:rPr>
+          <w:rFonts w:ascii="Arial" w:hAnsi="Arial"/>
+          <w:color w:val="334155"/>
+          <w:sz w:val="22"/>
+        </w:rPr>
+        <w:t>RF-09 / RF-010: Consulta de Ficha Personal, Cálculo de Metas Ponderadas y Semáforo Comunal. El sistema debe consolidar automáticamente los avances de actividades validadas contra las metas ponderadas fijadas por cargo (suma de ponderadores = 100%), aplicando el algoritmo del semáforo tricolor (Verde: &gt;= esperado, Ámbar: 60%-99%, Rojo: &lt; 60%), con tope del 150%, bonificaciones por felicitaciones y descuentos por reclamos.</w:t>
+      </w:r>
+    </w:p>
+    <w:p>
+      <w:pPr>
+        <w:spacing w:line="276" w:lineRule="auto" w:after="120" w:before="0"/>
+        <w:jc w:val="both"/>
+      </w:pPr>
+      <w:r>
+        <w:rPr>
+          <w:rFonts w:ascii="Arial" w:hAnsi="Arial"/>
+          <w:b/>
+          <w:color w:val="1E293B"/>
+          <w:sz w:val="22"/>
+        </w:rPr>
+        <w:t xml:space="preserve">2. Épica del Backlog: </w:t>
+      </w:r>
+      <w:r>
+        <w:rPr>
+          <w:rFonts w:ascii="Arial" w:hAnsi="Arial"/>
+          <w:color w:val="334155"/>
+          <w:sz w:val="22"/>
+        </w:rPr>
+        <w:t>EP-04: Medición del Desempeño, Semáforos y Metas SGR. Provee herramientas de inteligencia operacional para que Alcaldía, Administrador Municipal y Delegados supervisen objetivamente el cumplimiento de las metas colectivas e individuales.</w:t>
+      </w:r>
+    </w:p>
+    <w:p>
+      <w:pPr>
+        <w:spacing w:line="276" w:lineRule="auto" w:after="120" w:before="0"/>
+        <w:jc w:val="both"/>
+      </w:pPr>
+      <w:r>
+        <w:rPr>
+          <w:rFonts w:ascii="Arial" w:hAnsi="Arial"/>
+          <w:b/>
+          <w:color w:val="1E293B"/>
+          <w:sz w:val="22"/>
+        </w:rPr>
+        <w:t xml:space="preserve">3. Caso de Uso de Alto Nivel: </w:t>
+      </w:r>
+      <w:r>
+        <w:rPr>
+          <w:rFonts w:ascii="Arial" w:hAnsi="Arial"/>
+          <w:color w:val="334155"/>
+          <w:sz w:val="22"/>
+        </w:rPr>
+        <w:t>CU-04: Monitorear y Evaluar Desempeño Municipal. Permite la visualización ejecutiva del avance porcentual, estado de semáforos comunales y generación de informes oficiales imprimibles.</w:t>
+      </w:r>
+    </w:p>
+    <w:p>
+      <w:pPr>
+        <w:spacing w:line="276" w:lineRule="auto" w:after="120" w:before="0"/>
+        <w:jc w:val="both"/>
+      </w:pPr>
+      <w:r>
+        <w:rPr>
+          <w:rFonts w:ascii="Arial" w:hAnsi="Arial"/>
+          <w:b/>
+          <w:color w:val="1E293B"/>
+          <w:sz w:val="22"/>
+        </w:rPr>
+        <w:t xml:space="preserve">4. Caso de Uso Específico: </w:t>
+      </w:r>
+      <w:r>
+        <w:rPr>
+          <w:rFonts w:ascii="Arial" w:hAnsi="Arial"/>
+          <w:color w:val="334155"/>
+          <w:sz w:val="22"/>
+        </w:rPr>
+        <w:t>CU-04.1: Consultar Semáforo Comunal y Ficha de Cumplimiento Ponderado. A continuación se presenta el Cuadro Descriptivo Normalizado que formaliza la medición de resultados:</w:t>
+      </w:r>
+    </w:p>
+    <w:tbl>
+      <w:tblPr>
+        <w:tblW w:type="auto" w:w="0"/>
+        <w:jc w:val="center"/>
+        <w:tblLook w:firstColumn="1" w:firstRow="1" w:lastColumn="0" w:lastRow="0" w:noHBand="0" w:noVBand="1" w:val="04A0"/>
+        <w:tblBorders>
+          <w:top w:val="single" w:sz="4" w:space="0" w:color="CBD5E1"/>
+          <w:bottom w:val="single" w:sz="4" w:space="0" w:color="CBD5E1"/>
+          <w:insideH w:val="single" w:sz="4" w:space="0" w:color="CBD5E1"/>
+          <w:insideV w:val="single" w:sz="4" w:space="0" w:color="CBD5E1"/>
+          <w:left w:val="none"/>
+          <w:right w:val="none"/>
+        </w:tblBorders>
       </w:tblPr>
       <w:tblGrid>
         <w:gridCol w:w="4680"/>
@@ -18648,28 +18874,15 @@
         </w:trPr>
         <w:tc>
           <w:tcPr>
-            <w:tcW w:type="dxa" w:w="4680"/>
-            <w:shd w:fill="0F172A"/>
-            <w:tcMar>
-              <w:top w:w="120" w:type="dxa"/>
-              <w:bottom w:w="120" w:type="dxa"/>
-              <w:left w:w="150" w:type="dxa"/>
-              <w:right w:w="150" w:type="dxa"/>
-            </w:tcMar>
+            <w:tcW w:type="dxa" w:w="2880"/>
             <w:shd w:fill="1E293B"/>
-            <w:tcMar>
-              <w:top w:w="120" w:type="dxa"/>
-              <w:bottom w:w="120" w:type="dxa"/>
-              <w:left w:w="140" w:type="dxa"/>
-              <w:right w:w="140" w:type="dxa"/>
-            </w:tcMar>
-            <w:vAlign w:val="center"/>
-          </w:tcPr>
-          <w:p>
-            <w:pPr>
-              <w:spacing w:before="0" w:after="0"/>
-              <w:jc w:val="left"/>
-            </w:pPr>
+          </w:tcPr>
+          <w:p>
+            <w:pPr>
+              <w:spacing w:line="264" w:lineRule="auto" w:before="40" w:after="40"/>
+              <w:jc w:val="left"/>
+            </w:pPr>
+            <w:r/>
             <w:r>
               <w:rPr>
                 <w:rFonts w:ascii="Arial" w:hAnsi="Arial"/>
@@ -18677,34 +18890,21 @@
                 <w:color w:val="FFFFFF"/>
                 <w:sz w:val="19"/>
               </w:rPr>
-              <w:t>Artefacto en la Cadena</w:t>
-            </w:r>
-          </w:p>
-        </w:tc>
-        <w:tc>
-          <w:tcPr>
-            <w:tcW w:type="dxa" w:w="4680"/>
-            <w:shd w:fill="0F172A"/>
-            <w:tcMar>
-              <w:top w:w="120" w:type="dxa"/>
-              <w:bottom w:w="120" w:type="dxa"/>
-              <w:left w:w="150" w:type="dxa"/>
-              <w:right w:w="150" w:type="dxa"/>
-            </w:tcMar>
+              <w:t>Campo Específico</w:t>
+            </w:r>
+          </w:p>
+        </w:tc>
+        <w:tc>
+          <w:tcPr>
+            <w:tcW w:type="dxa" w:w="6912"/>
             <w:shd w:fill="1E293B"/>
-            <w:tcMar>
-              <w:top w:w="120" w:type="dxa"/>
-              <w:bottom w:w="120" w:type="dxa"/>
-              <w:left w:w="140" w:type="dxa"/>
-              <w:right w:w="140" w:type="dxa"/>
-            </w:tcMar>
-            <w:vAlign w:val="center"/>
-          </w:tcPr>
-          <w:p>
-            <w:pPr>
-              <w:spacing w:before="0" w:after="0"/>
-              <w:jc w:val="left"/>
-            </w:pPr>
+          </w:tcPr>
+          <w:p>
+            <w:pPr>
+              <w:spacing w:line="264" w:lineRule="auto" w:before="40" w:after="40"/>
+              <w:jc w:val="left"/>
+            </w:pPr>
+            <w:r/>
             <w:r>
               <w:rPr>
                 <w:rFonts w:ascii="Arial" w:hAnsi="Arial"/>
@@ -18712,7 +18912,7 @@
                 <w:color w:val="FFFFFF"/>
                 <w:sz w:val="19"/>
               </w:rPr>
-              <w:t>Especificación Técnica y Valor para el Proyecto</w:t>
+              <w:t>Detalle Operativo del Caso de Uso Específico</w:t>
             </w:r>
           </w:p>
         </w:tc>
@@ -18723,69 +18923,45 @@
         </w:trPr>
         <w:tc>
           <w:tcPr>
-            <w:tcW w:type="dxa" w:w="4680"/>
+            <w:tcW w:type="dxa" w:w="2880"/>
             <w:shd w:fill="F8FAFC"/>
-            <w:tcMar>
-              <w:top w:w="80" w:type="dxa"/>
-              <w:bottom w:w="80" w:type="dxa"/>
-              <w:left w:w="120" w:type="dxa"/>
-              <w:right w:w="120" w:type="dxa"/>
-            </w:tcMar>
-            <w:shd w:fill="F8FAFC"/>
-            <w:tcMar>
-              <w:top w:w="70" w:type="dxa"/>
-              <w:bottom w:w="70" w:type="dxa"/>
-              <w:left w:w="120" w:type="dxa"/>
-              <w:right w:w="120" w:type="dxa"/>
-            </w:tcMar>
-            <w:vAlign w:val="center"/>
-          </w:tcPr>
-          <w:p>
-            <w:pPr>
-              <w:spacing w:line="252" w:lineRule="auto" w:before="0" w:after="0"/>
-              <w:jc w:val="left"/>
-            </w:pPr>
-            <w:r>
-              <w:rPr>
-                <w:rFonts w:ascii="Arial" w:hAnsi="Arial"/>
+          </w:tcPr>
+          <w:p>
+            <w:pPr>
+              <w:spacing w:line="264" w:lineRule="auto" w:before="40" w:after="40"/>
+              <w:jc w:val="left"/>
+            </w:pPr>
+            <w:r/>
+            <w:r>
+              <w:rPr>
+                <w:rFonts w:ascii="Arial" w:hAnsi="Arial"/>
+                <w:b/>
                 <w:color w:val="1E293B"/>
                 <w:sz w:val="18"/>
               </w:rPr>
-              <w:t>1. Requerimiento Funcional</w:t>
-            </w:r>
-          </w:p>
-        </w:tc>
-        <w:tc>
-          <w:tcPr>
-            <w:tcW w:type="dxa" w:w="4680"/>
+              <w:t>Nombre del Caso de Uso</w:t>
+            </w:r>
+          </w:p>
+        </w:tc>
+        <w:tc>
+          <w:tcPr>
+            <w:tcW w:type="dxa" w:w="6912"/>
             <w:shd w:fill="F8FAFC"/>
-            <w:tcMar>
-              <w:top w:w="80" w:type="dxa"/>
-              <w:bottom w:w="80" w:type="dxa"/>
-              <w:left w:w="120" w:type="dxa"/>
-              <w:right w:w="120" w:type="dxa"/>
-            </w:tcMar>
-            <w:shd w:fill="F8FAFC"/>
-            <w:tcMar>
-              <w:top w:w="70" w:type="dxa"/>
-              <w:bottom w:w="70" w:type="dxa"/>
-              <w:left w:w="120" w:type="dxa"/>
-              <w:right w:w="120" w:type="dxa"/>
-            </w:tcMar>
-            <w:vAlign w:val="center"/>
-          </w:tcPr>
-          <w:p>
-            <w:pPr>
-              <w:spacing w:line="252" w:lineRule="auto" w:before="0" w:after="0"/>
-              <w:jc w:val="left"/>
-            </w:pPr>
-            <w:r>
-              <w:rPr>
-                <w:rFonts w:ascii="Arial" w:hAnsi="Arial"/>
-                <w:color w:val="1E293B"/>
+          </w:tcPr>
+          <w:p>
+            <w:pPr>
+              <w:spacing w:line="264" w:lineRule="auto" w:before="40" w:after="40"/>
+              <w:jc w:val="left"/>
+            </w:pPr>
+            <w:r/>
+            <w:r>
+              <w:rPr>
+                <w:rFonts w:ascii="Arial" w:hAnsi="Arial"/>
+                <w:b w:val="0"/>
+                <w:color w:val="334155"/>
                 <w:sz w:val="18"/>
               </w:rPr>
-              <w:t>RF-017: Tablero Kanban Intersectorial del Método Tubo de Trabajo.</w:t>
+              <w:t>CU-04.1: Consultar Semáforo Comunal y Ficha de Cumplimiento Ponderado</w:t>
             </w:r>
           </w:p>
         </w:tc>
@@ -18796,67 +18972,45 @@
         </w:trPr>
         <w:tc>
           <w:tcPr>
-            <w:tcW w:type="dxa" w:w="4680"/>
-            <w:tcMar>
-              <w:top w:w="80" w:type="dxa"/>
-              <w:bottom w:w="80" w:type="dxa"/>
-              <w:left w:w="120" w:type="dxa"/>
-              <w:right w:w="120" w:type="dxa"/>
-            </w:tcMar>
+            <w:tcW w:type="dxa" w:w="2880"/>
             <w:shd w:fill="FFFFFF"/>
-            <w:tcMar>
-              <w:top w:w="70" w:type="dxa"/>
-              <w:bottom w:w="70" w:type="dxa"/>
-              <w:left w:w="120" w:type="dxa"/>
-              <w:right w:w="120" w:type="dxa"/>
-            </w:tcMar>
-            <w:vAlign w:val="center"/>
-          </w:tcPr>
-          <w:p>
-            <w:pPr>
-              <w:spacing w:line="252" w:lineRule="auto" w:before="0" w:after="0"/>
-              <w:jc w:val="left"/>
-            </w:pPr>
-            <w:r>
-              <w:rPr>
-                <w:rFonts w:ascii="Arial" w:hAnsi="Arial"/>
+          </w:tcPr>
+          <w:p>
+            <w:pPr>
+              <w:spacing w:line="264" w:lineRule="auto" w:before="40" w:after="40"/>
+              <w:jc w:val="left"/>
+            </w:pPr>
+            <w:r/>
+            <w:r>
+              <w:rPr>
+                <w:rFonts w:ascii="Arial" w:hAnsi="Arial"/>
+                <w:b/>
                 <w:color w:val="1E293B"/>
                 <w:sz w:val="18"/>
               </w:rPr>
-              <w:t>2. Épica del Backlog</w:t>
-            </w:r>
-          </w:p>
-        </w:tc>
-        <w:tc>
-          <w:tcPr>
-            <w:tcW w:type="dxa" w:w="4680"/>
-            <w:tcMar>
-              <w:top w:w="80" w:type="dxa"/>
-              <w:bottom w:w="80" w:type="dxa"/>
-              <w:left w:w="120" w:type="dxa"/>
-              <w:right w:w="120" w:type="dxa"/>
-            </w:tcMar>
+              <w:t>Actor(es) Principales</w:t>
+            </w:r>
+          </w:p>
+        </w:tc>
+        <w:tc>
+          <w:tcPr>
+            <w:tcW w:type="dxa" w:w="6912"/>
             <w:shd w:fill="FFFFFF"/>
-            <w:tcMar>
-              <w:top w:w="70" w:type="dxa"/>
-              <w:bottom w:w="70" w:type="dxa"/>
-              <w:left w:w="120" w:type="dxa"/>
-              <w:right w:w="120" w:type="dxa"/>
-            </w:tcMar>
-            <w:vAlign w:val="center"/>
-          </w:tcPr>
-          <w:p>
-            <w:pPr>
-              <w:spacing w:line="252" w:lineRule="auto" w:before="0" w:after="0"/>
-              <w:jc w:val="left"/>
-            </w:pPr>
-            <w:r>
-              <w:rPr>
-                <w:rFonts w:ascii="Arial" w:hAnsi="Arial"/>
-                <w:color w:val="1E293B"/>
+          </w:tcPr>
+          <w:p>
+            <w:pPr>
+              <w:spacing w:line="264" w:lineRule="auto" w:before="40" w:after="40"/>
+              <w:jc w:val="left"/>
+            </w:pPr>
+            <w:r/>
+            <w:r>
+              <w:rPr>
+                <w:rFonts w:ascii="Arial" w:hAnsi="Arial"/>
+                <w:b w:val="0"/>
+                <w:color w:val="334155"/>
                 <w:sz w:val="18"/>
               </w:rPr>
-              <w:t>EP-02: Trazabilidad, Coordinación y Control Operativo del Tubo de Trabajo.</w:t>
+              <w:t>Coordinador Comunal (iniciador), Delegado Municipal (iniciador), Funcionario.</w:t>
             </w:r>
           </w:p>
         </w:tc>
@@ -18867,69 +19021,47 @@
         </w:trPr>
         <w:tc>
           <w:tcPr>
-            <w:tcW w:type="dxa" w:w="4680"/>
+            <w:tcW w:type="dxa" w:w="2880"/>
             <w:shd w:fill="F8FAFC"/>
-            <w:tcMar>
-              <w:top w:w="80" w:type="dxa"/>
-              <w:bottom w:w="80" w:type="dxa"/>
-              <w:left w:w="120" w:type="dxa"/>
-              <w:right w:w="120" w:type="dxa"/>
-            </w:tcMar>
-            <w:shd w:fill="F8FAFC"/>
-            <w:tcMar>
-              <w:top w:w="70" w:type="dxa"/>
-              <w:bottom w:w="70" w:type="dxa"/>
-              <w:left w:w="120" w:type="dxa"/>
-              <w:right w:w="120" w:type="dxa"/>
-            </w:tcMar>
-            <w:vAlign w:val="center"/>
-          </w:tcPr>
-          <w:p>
-            <w:pPr>
-              <w:spacing w:line="252" w:lineRule="auto" w:before="0" w:after="0"/>
-              <w:jc w:val="left"/>
-            </w:pPr>
-            <w:r>
-              <w:rPr>
-                <w:rFonts w:ascii="Arial" w:hAnsi="Arial"/>
+          </w:tcPr>
+          <w:p>
+            <w:pPr>
+              <w:spacing w:line="264" w:lineRule="auto" w:before="40" w:after="40"/>
+              <w:jc w:val="left"/>
+            </w:pPr>
+            <w:r/>
+            <w:r>
+              <w:rPr>
+                <w:rFonts w:ascii="Arial" w:hAnsi="Arial"/>
+                <w:b/>
                 <w:color w:val="1E293B"/>
                 <w:sz w:val="18"/>
               </w:rPr>
-              <w:t>3. Caso de Uso Alto Nivel</w:t>
-            </w:r>
-          </w:p>
-        </w:tc>
-        <w:tc>
-          <w:tcPr>
-            <w:tcW w:type="dxa" w:w="4680"/>
+              <w:t>Precondiciones</w:t>
+            </w:r>
+          </w:p>
+        </w:tc>
+        <w:tc>
+          <w:tcPr>
+            <w:tcW w:type="dxa" w:w="6912"/>
             <w:shd w:fill="F8FAFC"/>
-            <w:tcMar>
-              <w:top w:w="80" w:type="dxa"/>
-              <w:bottom w:w="80" w:type="dxa"/>
-              <w:left w:w="120" w:type="dxa"/>
-              <w:right w:w="120" w:type="dxa"/>
-            </w:tcMar>
-            <w:shd w:fill="F8FAFC"/>
-            <w:tcMar>
-              <w:top w:w="70" w:type="dxa"/>
-              <w:bottom w:w="70" w:type="dxa"/>
-              <w:left w:w="120" w:type="dxa"/>
-              <w:right w:w="120" w:type="dxa"/>
-            </w:tcMar>
-            <w:vAlign w:val="center"/>
-          </w:tcPr>
-          <w:p>
-            <w:pPr>
-              <w:spacing w:line="252" w:lineRule="auto" w:before="0" w:after="0"/>
-              <w:jc w:val="left"/>
-            </w:pPr>
-            <w:r>
-              <w:rPr>
-                <w:rFonts w:ascii="Arial" w:hAnsi="Arial"/>
-                <w:color w:val="1E293B"/>
+          </w:tcPr>
+          <w:p>
+            <w:pPr>
+              <w:spacing w:line="264" w:lineRule="auto" w:before="40" w:after="40"/>
+              <w:jc w:val="left"/>
+            </w:pPr>
+            <w:r/>
+            <w:r>
+              <w:rPr>
+                <w:rFonts w:ascii="Arial" w:hAnsi="Arial"/>
+                <w:b w:val="0"/>
+                <w:color w:val="334155"/>
                 <w:sz w:val="18"/>
               </w:rPr>
-              <w:t>CU-02: Gestionar Tubo de Trabajo Municipal.</w:t>
+              <w:t>1. Período de medición vigente configurado en el sistema.</w:t>
+              <w:br/>
+              <w:t>2. Metas y ponderadores fijados para los cargos de la delegación.</w:t>
             </w:r>
           </w:p>
         </w:tc>
@@ -18940,67 +19072,55 @@
         </w:trPr>
         <w:tc>
           <w:tcPr>
-            <w:tcW w:type="dxa" w:w="4680"/>
-            <w:tcMar>
-              <w:top w:w="80" w:type="dxa"/>
-              <w:bottom w:w="80" w:type="dxa"/>
-              <w:left w:w="120" w:type="dxa"/>
-              <w:right w:w="120" w:type="dxa"/>
-            </w:tcMar>
+            <w:tcW w:type="dxa" w:w="2880"/>
             <w:shd w:fill="FFFFFF"/>
-            <w:tcMar>
-              <w:top w:w="70" w:type="dxa"/>
-              <w:bottom w:w="70" w:type="dxa"/>
-              <w:left w:w="120" w:type="dxa"/>
-              <w:right w:w="120" w:type="dxa"/>
-            </w:tcMar>
-            <w:vAlign w:val="center"/>
-          </w:tcPr>
-          <w:p>
-            <w:pPr>
-              <w:spacing w:line="252" w:lineRule="auto" w:before="0" w:after="0"/>
-              <w:jc w:val="left"/>
-            </w:pPr>
-            <w:r>
-              <w:rPr>
-                <w:rFonts w:ascii="Arial" w:hAnsi="Arial"/>
+          </w:tcPr>
+          <w:p>
+            <w:pPr>
+              <w:spacing w:line="264" w:lineRule="auto" w:before="40" w:after="40"/>
+              <w:jc w:val="left"/>
+            </w:pPr>
+            <w:r/>
+            <w:r>
+              <w:rPr>
+                <w:rFonts w:ascii="Arial" w:hAnsi="Arial"/>
+                <w:b/>
                 <w:color w:val="1E293B"/>
                 <w:sz w:val="18"/>
               </w:rPr>
-              <w:t>4. Caso de Uso Específico</w:t>
-            </w:r>
-          </w:p>
-        </w:tc>
-        <w:tc>
-          <w:tcPr>
-            <w:tcW w:type="dxa" w:w="4680"/>
-            <w:tcMar>
-              <w:top w:w="80" w:type="dxa"/>
-              <w:bottom w:w="80" w:type="dxa"/>
-              <w:left w:w="120" w:type="dxa"/>
-              <w:right w:w="120" w:type="dxa"/>
-            </w:tcMar>
+              <w:t>Flujo Principal (Exitoso)</w:t>
+            </w:r>
+          </w:p>
+        </w:tc>
+        <w:tc>
+          <w:tcPr>
+            <w:tcW w:type="dxa" w:w="6912"/>
             <w:shd w:fill="FFFFFF"/>
-            <w:tcMar>
-              <w:top w:w="70" w:type="dxa"/>
-              <w:bottom w:w="70" w:type="dxa"/>
-              <w:left w:w="120" w:type="dxa"/>
-              <w:right w:w="120" w:type="dxa"/>
-            </w:tcMar>
-            <w:vAlign w:val="center"/>
-          </w:tcPr>
-          <w:p>
-            <w:pPr>
-              <w:spacing w:line="252" w:lineRule="auto" w:before="0" w:after="0"/>
-              <w:jc w:val="left"/>
-            </w:pPr>
-            <w:r>
-              <w:rPr>
-                <w:rFonts w:ascii="Arial" w:hAnsi="Arial"/>
-                <w:color w:val="1E293B"/>
+          </w:tcPr>
+          <w:p>
+            <w:pPr>
+              <w:spacing w:line="264" w:lineRule="auto" w:before="40" w:after="40"/>
+              <w:jc w:val="left"/>
+            </w:pPr>
+            <w:r/>
+            <w:r>
+              <w:rPr>
+                <w:rFonts w:ascii="Arial" w:hAnsi="Arial"/>
+                <w:b w:val="0"/>
+                <w:color w:val="334155"/>
                 <w:sz w:val="18"/>
               </w:rPr>
-              <w:t>CU-02.1: Visualizar y Transicionar Estados en Tablero Kanban (con cuadro normalizado).</w:t>
+              <w:t>1. El actor accede al módulo de Resultados (/resultados/).</w:t>
+              <w:br/>
+              <w:t>2. El sistema calcula en tiempo real el porcentaje de cumplimiento ponderado por delegación territorial.</w:t>
+              <w:br/>
+              <w:t>3. El sistema aplica las reglas del semáforo: Verde (Óptimo &gt;= 100%), Ámbar (Alerta 60-99%) y Rojo (Crítico &lt; 60%).</w:t>
+              <w:br/>
+              <w:t>4. El sistema despliega tarjetas de resumen comunal, dotación activa y barras de avance porcentual con tope del 150%.</w:t>
+              <w:br/>
+              <w:t>5. El actor selecciona una delegación para ver el desglose por funcionario o presiona 'Ver Ficha Individual'.</w:t>
+              <w:br/>
+              <w:t>6. El actor opcionalmente presiona 'Informe Formal' para generar la vista de reporte ejecutivo imprimible.</w:t>
             </w:r>
           </w:p>
         </w:tc>
@@ -19011,69 +19131,96 @@
         </w:trPr>
         <w:tc>
           <w:tcPr>
-            <w:tcW w:type="dxa" w:w="4680"/>
+            <w:tcW w:type="dxa" w:w="2880"/>
             <w:shd w:fill="F8FAFC"/>
-            <w:tcMar>
-              <w:top w:w="80" w:type="dxa"/>
-              <w:bottom w:w="80" w:type="dxa"/>
-              <w:left w:w="120" w:type="dxa"/>
-              <w:right w:w="120" w:type="dxa"/>
-            </w:tcMar>
-            <w:shd w:fill="F8FAFC"/>
-            <w:tcMar>
-              <w:top w:w="70" w:type="dxa"/>
-              <w:bottom w:w="70" w:type="dxa"/>
-              <w:left w:w="120" w:type="dxa"/>
-              <w:right w:w="120" w:type="dxa"/>
-            </w:tcMar>
-            <w:vAlign w:val="center"/>
-          </w:tcPr>
-          <w:p>
-            <w:pPr>
-              <w:spacing w:line="252" w:lineRule="auto" w:before="0" w:after="0"/>
-              <w:jc w:val="left"/>
-            </w:pPr>
-            <w:r>
-              <w:rPr>
-                <w:rFonts w:ascii="Arial" w:hAnsi="Arial"/>
+          </w:tcPr>
+          <w:p>
+            <w:pPr>
+              <w:spacing w:line="264" w:lineRule="auto" w:before="40" w:after="40"/>
+              <w:jc w:val="left"/>
+            </w:pPr>
+            <w:r/>
+            <w:r>
+              <w:rPr>
+                <w:rFonts w:ascii="Arial" w:hAnsi="Arial"/>
+                <w:b/>
                 <w:color w:val="1E293B"/>
                 <w:sz w:val="18"/>
               </w:rPr>
-              <w:t>5. Wireframe Front-End</w:t>
-            </w:r>
-          </w:p>
-        </w:tc>
-        <w:tc>
-          <w:tcPr>
-            <w:tcW w:type="dxa" w:w="4680"/>
+              <w:t>Flujos Alternativos / Excepciones</w:t>
+            </w:r>
+          </w:p>
+        </w:tc>
+        <w:tc>
+          <w:tcPr>
+            <w:tcW w:type="dxa" w:w="6912"/>
             <w:shd w:fill="F8FAFC"/>
-            <w:tcMar>
-              <w:top w:w="80" w:type="dxa"/>
-              <w:bottom w:w="80" w:type="dxa"/>
-              <w:left w:w="120" w:type="dxa"/>
-              <w:right w:w="120" w:type="dxa"/>
-            </w:tcMar>
-            <w:shd w:fill="F8FAFC"/>
-            <w:tcMar>
-              <w:top w:w="70" w:type="dxa"/>
-              <w:bottom w:w="70" w:type="dxa"/>
-              <w:left w:w="120" w:type="dxa"/>
-              <w:right w:w="120" w:type="dxa"/>
-            </w:tcMar>
-            <w:vAlign w:val="center"/>
-          </w:tcPr>
-          <w:p>
-            <w:pPr>
-              <w:spacing w:line="252" w:lineRule="auto" w:before="0" w:after="0"/>
-              <w:jc w:val="left"/>
-            </w:pPr>
-            <w:r>
-              <w:rPr>
-                <w:rFonts w:ascii="Arial" w:hAnsi="Arial"/>
+          </w:tcPr>
+          <w:p>
+            <w:pPr>
+              <w:spacing w:line="264" w:lineRule="auto" w:before="40" w:after="40"/>
+              <w:jc w:val="left"/>
+            </w:pPr>
+            <w:r/>
+            <w:r>
+              <w:rPr>
+                <w:rFonts w:ascii="Arial" w:hAnsi="Arial"/>
+                <w:b w:val="0"/>
+                <w:color w:val="334155"/>
+                <w:sz w:val="18"/>
+              </w:rPr>
+              <w:t>A1. Funcionario con Felicitaciones o Reclamos: El sistema aplica bonificación (+10% por felicitación) o penalización (-20% a -30% por reclamo) sobre el cumplimiento final antes de pintar el semáforo.</w:t>
+              <w:br/>
+              <w:t>A2. Período sin Metas Asignadas: El sistema emite advertencia de configuración e invita a configurar metas en los mantenedores.</w:t>
+            </w:r>
+          </w:p>
+        </w:tc>
+      </w:tr>
+      <w:tr>
+        <w:trPr>
+          <w:cantSplit/>
+        </w:trPr>
+        <w:tc>
+          <w:tcPr>
+            <w:tcW w:type="dxa" w:w="2880"/>
+            <w:shd w:fill="FFFFFF"/>
+          </w:tcPr>
+          <w:p>
+            <w:pPr>
+              <w:spacing w:line="264" w:lineRule="auto" w:before="40" w:after="40"/>
+              <w:jc w:val="left"/>
+            </w:pPr>
+            <w:r/>
+            <w:r>
+              <w:rPr>
+                <w:rFonts w:ascii="Arial" w:hAnsi="Arial"/>
+                <w:b/>
                 <w:color w:val="1E293B"/>
                 <w:sz w:val="18"/>
               </w:rPr>
-              <w:t>Tablero visual de 4 columnas (Ingresados, Pendientes, En Proceso, Realizados) con badges de origen.</w:t>
+              <w:t>Postcondiciones</w:t>
+            </w:r>
+          </w:p>
+        </w:tc>
+        <w:tc>
+          <w:tcPr>
+            <w:tcW w:type="dxa" w:w="6912"/>
+            <w:shd w:fill="FFFFFF"/>
+          </w:tcPr>
+          <w:p>
+            <w:pPr>
+              <w:spacing w:line="264" w:lineRule="auto" w:before="40" w:after="40"/>
+              <w:jc w:val="left"/>
+            </w:pPr>
+            <w:r/>
+            <w:r>
+              <w:rPr>
+                <w:rFonts w:ascii="Arial" w:hAnsi="Arial"/>
+                <w:b w:val="0"/>
+                <w:color w:val="334155"/>
+                <w:sz w:val="18"/>
+              </w:rPr>
+              <w:t>El estado de cumplimiento queda auditado y listo para consulta o exportación ejecutiva.</w:t>
             </w:r>
           </w:p>
         </w:tc>
@@ -19081,17 +19228,40 @@
     </w:tbl>
     <w:p>
       <w:pPr>
-        <w:spacing w:before="160" w:after="60"/>
-        <w:jc w:val="left"/>
+        <w:spacing w:line="276" w:lineRule="auto" w:after="120" w:before="120"/>
+        <w:jc w:val="both"/>
       </w:pPr>
       <w:r>
         <w:rPr>
           <w:rFonts w:ascii="Arial" w:hAnsi="Arial"/>
           <w:b/>
-          <w:color w:val="1E3A8A"/>
+          <w:color w:val="1E293B"/>
+          <w:sz w:val="22"/>
+        </w:rPr>
+        <w:t xml:space="preserve">5. Wireframe (Front-End): </w:t>
+      </w:r>
+      <w:r>
+        <w:rPr>
+          <w:rFonts w:ascii="Arial" w:hAnsi="Arial"/>
+          <w:color w:val="334155"/>
+          <w:sz w:val="22"/>
+        </w:rPr>
+        <w:t>A continuación se presenta el Wireframe Front-End implementado en la plataforma web que materializa el Caso de Uso CU-04.1 y los Requerimientos Funcionales RF-09 / RF-010:</w:t>
+      </w:r>
+    </w:p>
+    <w:p>
+      <w:pPr>
+        <w:spacing w:line="276" w:lineRule="auto" w:after="60" w:before="120"/>
+        <w:jc w:val="center"/>
+      </w:pPr>
+      <w:r>
+        <w:rPr>
+          <w:rFonts w:ascii="Arial" w:hAnsi="Arial"/>
+          <w:b/>
+          <w:color w:val="0F172A"/>
           <w:sz w:val="21"/>
         </w:rPr>
-        <w:t>Cuadro Normalizado: Caso de Uso Específico CU-02.1</w:t>
+        <w:t>Figura 3: Wireframe Front-End — Tablero Comunal de Resultados y Semáforo de Desempeño SGR</w:t>
       </w:r>
     </w:p>
     <w:tbl>
@@ -19099,10 +19269,148 @@
         <w:tblW w:type="auto" w:w="0"/>
         <w:jc w:val="center"/>
         <w:tblLook w:firstColumn="1" w:firstRow="1" w:lastColumn="0" w:lastRow="0" w:noHBand="0" w:noVBand="1" w:val="04A0"/>
+        <w:tblBorders>
+          <w:top w:val="dashed" w:sz="8" w:space="0" w:color="94A3B8"/>
+          <w:bottom w:val="dashed" w:sz="8" w:space="0" w:color="94A3B8"/>
+          <w:left w:val="dashed" w:sz="8" w:space="0" w:color="94A3B8"/>
+          <w:right w:val="dashed" w:sz="8" w:space="0" w:color="94A3B8"/>
+          <w:insideH w:val="none"/>
+          <w:insideV w:val="none"/>
+        </w:tblBorders>
       </w:tblPr>
       <w:tblGrid>
-        <w:gridCol w:w="4680"/>
-        <w:gridCol w:w="4680"/>
+        <w:gridCol w:w="9360"/>
+      </w:tblGrid>
+      <w:tr>
+        <w:trPr>
+          <w:cantSplit/>
+        </w:trPr>
+        <w:tc>
+          <w:tcPr>
+            <w:tcW w:type="dxa" w:w="9792"/>
+            <w:shd w:fill="F8FAFC"/>
+          </w:tcPr>
+          <w:p>
+            <w:pPr>
+              <w:spacing w:line="300" w:lineRule="auto" w:before="560" w:after="560"/>
+              <w:jc w:val="center"/>
+            </w:pPr>
+            <w:r/>
+            <w:r>
+              <w:rPr>
+                <w:rFonts w:ascii="Arial" w:hAnsi="Arial"/>
+                <w:b/>
+                <w:color w:val="2563EB"/>
+                <w:sz w:val="23"/>
+              </w:rPr>
+              <w:t>📷 [ PEGAR AQUÍ CAPTURA DE PANTALLA / WIREFRAME FRONT-END ]</w:t>
+              <w:br/>
+            </w:r>
+            <w:r>
+              <w:rPr>
+                <w:rFonts w:ascii="Arial" w:hAnsi="Arial"/>
+                <w:b/>
+                <w:color w:val="1E293B"/>
+                <w:sz w:val="20"/>
+              </w:rPr>
+              <w:t>Pantalla: Tablero Comunal de Resultados y Semáforo de Desempeño SGR</w:t>
+              <w:br/>
+            </w:r>
+            <w:r>
+              <w:rPr>
+                <w:rFonts w:ascii="Consolas" w:hAnsi="Consolas"/>
+                <w:color w:val="0F766E"/>
+                <w:sz w:val="19"/>
+              </w:rPr>
+              <w:t>URL de Acceso en Servidor Cloud: http://3.229.11.31/resultados/</w:t>
+              <w:br/>
+            </w:r>
+            <w:r>
+              <w:rPr>
+                <w:rFonts w:ascii="Arial" w:hAnsi="Arial"/>
+                <w:color w:val="64748B"/>
+                <w:sz w:val="18"/>
+              </w:rPr>
+              <w:t>Usuario de Prueba: coordinador | Contraseña: pass1234</w:t>
+              <w:br/>
+              <w:br/>
+            </w:r>
+            <w:r>
+              <w:rPr>
+                <w:rFonts w:ascii="Arial" w:hAnsi="Arial"/>
+                <w:i/>
+                <w:color w:val="94A3B8"/>
+                <w:sz w:val="17"/>
+              </w:rPr>
+              <w:t>(Haz clic en este recuadro y presiona Ctrl+V para pegar directamente el pantallazo tomado desde el navegador)</w:t>
+            </w:r>
+          </w:p>
+        </w:tc>
+      </w:tr>
+    </w:tbl>
+    <w:p>
+      <w:pPr>
+        <w:spacing w:line="276" w:lineRule="auto" w:after="200" w:before="80"/>
+        <w:jc w:val="both"/>
+      </w:pPr>
+      <w:r>
+        <w:rPr>
+          <w:rFonts w:ascii="Arial" w:hAnsi="Arial"/>
+          <w:i/>
+          <w:color w:val="475569"/>
+          <w:sz w:val="19"/>
+        </w:rPr>
+        <w:t>Componentes Clave a Visualizar en la Interfaz: Tarjetas de métricas consolidadas comunales, semáforos por delegación territorial (Verde, Ámbar, Rojo), barras de cumplimiento con límite institucional del 150%, tabla de desglose por funcionario con bonificaciones por felicitaciones y botón para emisión de informe imprimible de Alcaldía.</w:t>
+      </w:r>
+    </w:p>
+    <w:p>
+      <w:pPr>
+        <w:pStyle w:val="Heading3"/>
+        <w:spacing w:before="280" w:after="80"/>
+      </w:pPr>
+      <w:r>
+        <w:rPr>
+          <w:rFonts w:ascii="Arial" w:hAnsi="Arial"/>
+          <w:b/>
+          <w:color w:val="1E293B"/>
+          <w:sz w:val="22"/>
+        </w:rPr>
+        <w:t>3.7.4 Resumen de Acceso a los Prototipos Front-End en Producción (Cloud AWS)</w:t>
+      </w:r>
+    </w:p>
+    <w:p>
+      <w:pPr>
+        <w:spacing w:line="276" w:lineRule="auto" w:after="120" w:before="0"/>
+        <w:jc w:val="both"/>
+      </w:pPr>
+      <w:r>
+        <w:rPr>
+          <w:rFonts w:ascii="Arial" w:hAnsi="Arial"/>
+          <w:color w:val="334155"/>
+          <w:sz w:val="22"/>
+        </w:rPr>
+        <w:t>Para facilitar la revisión y evaluación interactiva por parte de la docente guía, los tres Wireframes y el sistema completo se encuentran desplegados y plenamente operativos en el servidor cloud institucional. La siguiente tabla consolida las rutas, credenciales y propósitos de cada pantalla:</w:t>
+      </w:r>
+    </w:p>
+    <w:tbl>
+      <w:tblPr>
+        <w:tblW w:type="auto" w:w="0"/>
+        <w:jc w:val="center"/>
+        <w:tblLook w:firstColumn="1" w:firstRow="1" w:lastColumn="0" w:lastRow="0" w:noHBand="0" w:noVBand="1" w:val="04A0"/>
+        <w:tblBorders>
+          <w:top w:val="single" w:sz="4" w:space="0" w:color="CBD5E1"/>
+          <w:bottom w:val="single" w:sz="4" w:space="0" w:color="CBD5E1"/>
+          <w:insideH w:val="single" w:sz="4" w:space="0" w:color="CBD5E1"/>
+          <w:insideV w:val="single" w:sz="4" w:space="0" w:color="CBD5E1"/>
+          <w:left w:val="none"/>
+          <w:right w:val="none"/>
+        </w:tblBorders>
+      </w:tblPr>
+      <w:tblGrid>
+        <w:gridCol w:w="2340"/>
+        <w:gridCol w:w="2340"/>
+        <w:gridCol w:w="2340"/>
+        <w:gridCol w:w="2340"/>
       </w:tblGrid>
       <w:tr>
         <w:trPr>
@@ -19111,28 +19419,15 @@
         </w:trPr>
         <w:tc>
           <w:tcPr>
-            <w:tcW w:type="dxa" w:w="4680"/>
-            <w:shd w:fill="0369A1"/>
-            <w:tcMar>
-              <w:top w:w="120" w:type="dxa"/>
-              <w:bottom w:w="120" w:type="dxa"/>
-              <w:left w:w="150" w:type="dxa"/>
-              <w:right w:w="150" w:type="dxa"/>
-            </w:tcMar>
+            <w:tcW w:type="dxa" w:w="2592"/>
             <w:shd w:fill="1E293B"/>
-            <w:tcMar>
-              <w:top w:w="120" w:type="dxa"/>
-              <w:bottom w:w="120" w:type="dxa"/>
-              <w:left w:w="140" w:type="dxa"/>
-              <w:right w:w="140" w:type="dxa"/>
-            </w:tcMar>
-            <w:vAlign w:val="center"/>
-          </w:tcPr>
-          <w:p>
-            <w:pPr>
-              <w:spacing w:before="0" w:after="0"/>
-              <w:jc w:val="left"/>
-            </w:pPr>
+          </w:tcPr>
+          <w:p>
+            <w:pPr>
+              <w:spacing w:line="264" w:lineRule="auto" w:before="40" w:after="40"/>
+              <w:jc w:val="left"/>
+            </w:pPr>
+            <w:r/>
             <w:r>
               <w:rPr>
                 <w:rFonts w:ascii="Arial" w:hAnsi="Arial"/>
@@ -19140,34 +19435,21 @@
                 <w:color w:val="FFFFFF"/>
                 <w:sz w:val="19"/>
               </w:rPr>
-              <w:t>Campo Específico</w:t>
-            </w:r>
-          </w:p>
-        </w:tc>
-        <w:tc>
-          <w:tcPr>
-            <w:tcW w:type="dxa" w:w="4680"/>
-            <w:shd w:fill="0369A1"/>
-            <w:tcMar>
-              <w:top w:w="120" w:type="dxa"/>
-              <w:bottom w:w="120" w:type="dxa"/>
-              <w:left w:w="150" w:type="dxa"/>
-              <w:right w:w="150" w:type="dxa"/>
-            </w:tcMar>
+              <w:t>Pantalla / Wireframe</w:t>
+            </w:r>
+          </w:p>
+        </w:tc>
+        <w:tc>
+          <w:tcPr>
+            <w:tcW w:type="dxa" w:w="3168"/>
             <w:shd w:fill="1E293B"/>
-            <w:tcMar>
-              <w:top w:w="120" w:type="dxa"/>
-              <w:bottom w:w="120" w:type="dxa"/>
-              <w:left w:w="140" w:type="dxa"/>
-              <w:right w:w="140" w:type="dxa"/>
-            </w:tcMar>
-            <w:vAlign w:val="center"/>
-          </w:tcPr>
-          <w:p>
-            <w:pPr>
-              <w:spacing w:before="0" w:after="0"/>
-              <w:jc w:val="left"/>
-            </w:pPr>
+          </w:tcPr>
+          <w:p>
+            <w:pPr>
+              <w:spacing w:line="264" w:lineRule="auto" w:before="40" w:after="40"/>
+              <w:jc w:val="left"/>
+            </w:pPr>
+            <w:r/>
             <w:r>
               <w:rPr>
                 <w:rFonts w:ascii="Arial" w:hAnsi="Arial"/>
@@ -19175,7 +19457,51 @@
                 <w:color w:val="FFFFFF"/>
                 <w:sz w:val="19"/>
               </w:rPr>
-              <w:t>Detalle Operativo del Caso de Uso</w:t>
+              <w:t>URL en Producción (AWS EC2)</w:t>
+            </w:r>
+          </w:p>
+        </w:tc>
+        <w:tc>
+          <w:tcPr>
+            <w:tcW w:type="dxa" w:w="1872"/>
+            <w:shd w:fill="1E293B"/>
+          </w:tcPr>
+          <w:p>
+            <w:pPr>
+              <w:spacing w:line="264" w:lineRule="auto" w:before="40" w:after="40"/>
+              <w:jc w:val="left"/>
+            </w:pPr>
+            <w:r/>
+            <w:r>
+              <w:rPr>
+                <w:rFonts w:ascii="Arial" w:hAnsi="Arial"/>
+                <w:b/>
+                <w:color w:val="FFFFFF"/>
+                <w:sz w:val="19"/>
+              </w:rPr>
+              <w:t>Usuario / Clave</w:t>
+            </w:r>
+          </w:p>
+        </w:tc>
+        <w:tc>
+          <w:tcPr>
+            <w:tcW w:type="dxa" w:w="2880"/>
+            <w:shd w:fill="1E293B"/>
+          </w:tcPr>
+          <w:p>
+            <w:pPr>
+              <w:spacing w:line="264" w:lineRule="auto" w:before="40" w:after="40"/>
+              <w:jc w:val="left"/>
+            </w:pPr>
+            <w:r/>
+            <w:r>
+              <w:rPr>
+                <w:rFonts w:ascii="Arial" w:hAnsi="Arial"/>
+                <w:b/>
+                <w:color w:val="FFFFFF"/>
+                <w:sz w:val="19"/>
+              </w:rPr>
+              <w:t>Propósito en la Evaluación</w:t>
             </w:r>
           </w:p>
         </w:tc>
@@ -19186,69 +19512,91 @@
         </w:trPr>
         <w:tc>
           <w:tcPr>
-            <w:tcW w:type="dxa" w:w="4680"/>
+            <w:tcW w:type="dxa" w:w="2592"/>
             <w:shd w:fill="F8FAFC"/>
-            <w:tcMar>
-              <w:top w:w="80" w:type="dxa"/>
-              <w:bottom w:w="80" w:type="dxa"/>
-              <w:left w:w="120" w:type="dxa"/>
-              <w:right w:w="120" w:type="dxa"/>
-            </w:tcMar>
-            <w:shd w:fill="F8FAFC"/>
-            <w:tcMar>
-              <w:top w:w="70" w:type="dxa"/>
-              <w:bottom w:w="70" w:type="dxa"/>
-              <w:left w:w="120" w:type="dxa"/>
-              <w:right w:w="120" w:type="dxa"/>
-            </w:tcMar>
-            <w:vAlign w:val="center"/>
-          </w:tcPr>
-          <w:p>
-            <w:pPr>
-              <w:spacing w:line="252" w:lineRule="auto" w:before="0" w:after="0"/>
-              <w:jc w:val="left"/>
-            </w:pPr>
-            <w:r>
-              <w:rPr>
-                <w:rFonts w:ascii="Arial" w:hAnsi="Arial"/>
+          </w:tcPr>
+          <w:p>
+            <w:pPr>
+              <w:spacing w:line="264" w:lineRule="auto" w:before="40" w:after="40"/>
+              <w:jc w:val="left"/>
+            </w:pPr>
+            <w:r/>
+            <w:r>
+              <w:rPr>
+                <w:rFonts w:ascii="Arial" w:hAnsi="Arial"/>
+                <w:b/>
                 <w:color w:val="1E293B"/>
                 <w:sz w:val="18"/>
               </w:rPr>
-              <w:t>Nombre del Caso de Uso</w:t>
-            </w:r>
-          </w:p>
-        </w:tc>
-        <w:tc>
-          <w:tcPr>
-            <w:tcW w:type="dxa" w:w="4680"/>
+              <w:t>Wireframe 1: Formulario Unificado</w:t>
+            </w:r>
+          </w:p>
+        </w:tc>
+        <w:tc>
+          <w:tcPr>
+            <w:tcW w:type="dxa" w:w="3168"/>
             <w:shd w:fill="F8FAFC"/>
-            <w:tcMar>
-              <w:top w:w="80" w:type="dxa"/>
-              <w:bottom w:w="80" w:type="dxa"/>
-              <w:left w:w="120" w:type="dxa"/>
-              <w:right w:w="120" w:type="dxa"/>
-            </w:tcMar>
+          </w:tcPr>
+          <w:p>
+            <w:pPr>
+              <w:spacing w:line="264" w:lineRule="auto" w:before="40" w:after="40"/>
+              <w:jc w:val="left"/>
+            </w:pPr>
+            <w:r/>
+            <w:r>
+              <w:rPr>
+                <w:rFonts w:ascii="Consolas" w:hAnsi="Consolas"/>
+                <w:b w:val="0"/>
+                <w:color w:val="0F766E"/>
+                <w:sz w:val="17"/>
+              </w:rPr>
+              <w:t>http://3.229.11.31/actividades/nueva/</w:t>
+            </w:r>
+          </w:p>
+        </w:tc>
+        <w:tc>
+          <w:tcPr>
+            <w:tcW w:type="dxa" w:w="1872"/>
             <w:shd w:fill="F8FAFC"/>
-            <w:tcMar>
-              <w:top w:w="70" w:type="dxa"/>
-              <w:bottom w:w="70" w:type="dxa"/>
-              <w:left w:w="120" w:type="dxa"/>
-              <w:right w:w="120" w:type="dxa"/>
-            </w:tcMar>
-            <w:vAlign w:val="center"/>
-          </w:tcPr>
-          <w:p>
-            <w:pPr>
-              <w:spacing w:line="252" w:lineRule="auto" w:before="0" w:after="0"/>
-              <w:jc w:val="left"/>
-            </w:pPr>
-            <w:r>
-              <w:rPr>
-                <w:rFonts w:ascii="Arial" w:hAnsi="Arial"/>
-                <w:color w:val="1E293B"/>
+          </w:tcPr>
+          <w:p>
+            <w:pPr>
+              <w:spacing w:line="264" w:lineRule="auto" w:before="40" w:after="40"/>
+              <w:jc w:val="left"/>
+            </w:pPr>
+            <w:r/>
+            <w:r>
+              <w:rPr>
+                <w:rFonts w:ascii="Arial" w:hAnsi="Arial"/>
+                <w:b w:val="0"/>
+                <w:color w:val="334155"/>
                 <w:sz w:val="18"/>
               </w:rPr>
-              <w:t>CU-02.1: Visualizar y Transicionar Estados en Tablero Kanban</w:t>
+              <w:t>funcionario_compa</w:t>
+              <w:br/>
+              <w:t>pass1234</w:t>
+            </w:r>
+          </w:p>
+        </w:tc>
+        <w:tc>
+          <w:tcPr>
+            <w:tcW w:type="dxa" w:w="2880"/>
+            <w:shd w:fill="F8FAFC"/>
+          </w:tcPr>
+          <w:p>
+            <w:pPr>
+              <w:spacing w:line="264" w:lineRule="auto" w:before="40" w:after="40"/>
+              <w:jc w:val="left"/>
+            </w:pPr>
+            <w:r/>
+            <w:r>
+              <w:rPr>
+                <w:rFonts w:ascii="Arial" w:hAnsi="Arial"/>
+                <w:b w:val="0"/>
+                <w:color w:val="334155"/>
+                <w:sz w:val="18"/>
+              </w:rPr>
+              <w:t>Registro unificado de gestiones y switch de derivación reactiva al Tubo.</w:t>
             </w:r>
           </w:p>
         </w:tc>
@@ -19259,67 +19607,91 @@
         </w:trPr>
         <w:tc>
           <w:tcPr>
-            <w:tcW w:type="dxa" w:w="4680"/>
-            <w:tcMar>
-              <w:top w:w="80" w:type="dxa"/>
-              <w:bottom w:w="80" w:type="dxa"/>
-              <w:left w:w="120" w:type="dxa"/>
-              <w:right w:w="120" w:type="dxa"/>
-            </w:tcMar>
+            <w:tcW w:type="dxa" w:w="2592"/>
             <w:shd w:fill="FFFFFF"/>
-            <w:tcMar>
-              <w:top w:w="70" w:type="dxa"/>
-              <w:bottom w:w="70" w:type="dxa"/>
-              <w:left w:w="120" w:type="dxa"/>
-              <w:right w:w="120" w:type="dxa"/>
-            </w:tcMar>
-            <w:vAlign w:val="center"/>
-          </w:tcPr>
-          <w:p>
-            <w:pPr>
-              <w:spacing w:line="252" w:lineRule="auto" w:before="0" w:after="0"/>
-              <w:jc w:val="left"/>
-            </w:pPr>
-            <w:r>
-              <w:rPr>
-                <w:rFonts w:ascii="Arial" w:hAnsi="Arial"/>
+          </w:tcPr>
+          <w:p>
+            <w:pPr>
+              <w:spacing w:line="264" w:lineRule="auto" w:before="40" w:after="40"/>
+              <w:jc w:val="left"/>
+            </w:pPr>
+            <w:r/>
+            <w:r>
+              <w:rPr>
+                <w:rFonts w:ascii="Arial" w:hAnsi="Arial"/>
+                <w:b/>
                 <w:color w:val="1E293B"/>
                 <w:sz w:val="18"/>
               </w:rPr>
-              <w:t>Actor(es) Principales</w:t>
-            </w:r>
-          </w:p>
-        </w:tc>
-        <w:tc>
-          <w:tcPr>
-            <w:tcW w:type="dxa" w:w="4680"/>
-            <w:tcMar>
-              <w:top w:w="80" w:type="dxa"/>
-              <w:bottom w:w="80" w:type="dxa"/>
-              <w:left w:w="120" w:type="dxa"/>
-              <w:right w:w="120" w:type="dxa"/>
-            </w:tcMar>
+              <w:t>Wireframe 2: Tablero Kanban Tubo</w:t>
+            </w:r>
+          </w:p>
+        </w:tc>
+        <w:tc>
+          <w:tcPr>
+            <w:tcW w:type="dxa" w:w="3168"/>
             <w:shd w:fill="FFFFFF"/>
-            <w:tcMar>
-              <w:top w:w="70" w:type="dxa"/>
-              <w:bottom w:w="70" w:type="dxa"/>
-              <w:left w:w="120" w:type="dxa"/>
-              <w:right w:w="120" w:type="dxa"/>
-            </w:tcMar>
-            <w:vAlign w:val="center"/>
-          </w:tcPr>
-          <w:p>
-            <w:pPr>
-              <w:spacing w:line="252" w:lineRule="auto" w:before="0" w:after="0"/>
-              <w:jc w:val="left"/>
-            </w:pPr>
-            <w:r>
-              <w:rPr>
-                <w:rFonts w:ascii="Arial" w:hAnsi="Arial"/>
-                <w:color w:val="1E293B"/>
+          </w:tcPr>
+          <w:p>
+            <w:pPr>
+              <w:spacing w:line="264" w:lineRule="auto" w:before="40" w:after="40"/>
+              <w:jc w:val="left"/>
+            </w:pPr>
+            <w:r/>
+            <w:r>
+              <w:rPr>
+                <w:rFonts w:ascii="Consolas" w:hAnsi="Consolas"/>
+                <w:b w:val="0"/>
+                <w:color w:val="0F766E"/>
+                <w:sz w:val="17"/>
+              </w:rPr>
+              <w:t>http://3.229.11.31/agenda/resumen/</w:t>
+            </w:r>
+          </w:p>
+        </w:tc>
+        <w:tc>
+          <w:tcPr>
+            <w:tcW w:type="dxa" w:w="1872"/>
+            <w:shd w:fill="FFFFFF"/>
+          </w:tcPr>
+          <w:p>
+            <w:pPr>
+              <w:spacing w:line="264" w:lineRule="auto" w:before="40" w:after="40"/>
+              <w:jc w:val="left"/>
+            </w:pPr>
+            <w:r/>
+            <w:r>
+              <w:rPr>
+                <w:rFonts w:ascii="Arial" w:hAnsi="Arial"/>
+                <w:b w:val="0"/>
+                <w:color w:val="334155"/>
                 <w:sz w:val="18"/>
               </w:rPr>
-              <w:t>Delegado Municipal (iniciador), Coordinador Comunal (iniciador), Funcionario Responsable.</w:t>
+              <w:t>delegado_compa</w:t>
+              <w:br/>
+              <w:t>pass1234</w:t>
+            </w:r>
+          </w:p>
+        </w:tc>
+        <w:tc>
+          <w:tcPr>
+            <w:tcW w:type="dxa" w:w="2880"/>
+            <w:shd w:fill="FFFFFF"/>
+          </w:tcPr>
+          <w:p>
+            <w:pPr>
+              <w:spacing w:line="264" w:lineRule="auto" w:before="40" w:after="40"/>
+              <w:jc w:val="left"/>
+            </w:pPr>
+            <w:r/>
+            <w:r>
+              <w:rPr>
+                <w:rFonts w:ascii="Arial" w:hAnsi="Arial"/>
+                <w:b w:val="0"/>
+                <w:color w:val="334155"/>
+                <w:sz w:val="18"/>
+              </w:rPr>
+              <w:t>Seguimiento intersectorial en 4 columnas con insignias relacionales [GES].</w:t>
             </w:r>
           </w:p>
         </w:tc>
@@ -19330,72 +19702,91 @@
         </w:trPr>
         <w:tc>
           <w:tcPr>
-            <w:tcW w:type="dxa" w:w="4680"/>
+            <w:tcW w:type="dxa" w:w="2592"/>
             <w:shd w:fill="F8FAFC"/>
-            <w:tcMar>
-              <w:top w:w="80" w:type="dxa"/>
-              <w:bottom w:w="80" w:type="dxa"/>
-              <w:left w:w="120" w:type="dxa"/>
-              <w:right w:w="120" w:type="dxa"/>
-            </w:tcMar>
-            <w:shd w:fill="F8FAFC"/>
-            <w:tcMar>
-              <w:top w:w="70" w:type="dxa"/>
-              <w:bottom w:w="70" w:type="dxa"/>
-              <w:left w:w="120" w:type="dxa"/>
-              <w:right w:w="120" w:type="dxa"/>
-            </w:tcMar>
-            <w:vAlign w:val="center"/>
-          </w:tcPr>
-          <w:p>
-            <w:pPr>
-              <w:spacing w:line="252" w:lineRule="auto" w:before="0" w:after="0"/>
-              <w:jc w:val="left"/>
-            </w:pPr>
+          </w:tcPr>
+          <w:p>
+            <w:pPr>
+              <w:spacing w:line="264" w:lineRule="auto" w:before="40" w:after="40"/>
+              <w:jc w:val="left"/>
+            </w:pPr>
+            <w:r/>
             <w:r>
               <w:rPr>
                 <w:rFonts w:ascii="Arial" w:hAnsi="Arial"/>
                 <w:b/>
-                <w:color w:val="1E3A8A"/>
-                <w:sz w:val="18"/>
-              </w:rPr>
-              <w:t>Precondiciones</w:t>
-            </w:r>
-          </w:p>
-        </w:tc>
-        <w:tc>
-          <w:tcPr>
-            <w:tcW w:type="dxa" w:w="4680"/>
-            <w:shd w:fill="F8FAFC"/>
-            <w:tcMar>
-              <w:top w:w="80" w:type="dxa"/>
-              <w:bottom w:w="80" w:type="dxa"/>
-              <w:left w:w="120" w:type="dxa"/>
-              <w:right w:w="120" w:type="dxa"/>
-            </w:tcMar>
-            <w:shd w:fill="F8FAFC"/>
-            <w:tcMar>
-              <w:top w:w="70" w:type="dxa"/>
-              <w:bottom w:w="70" w:type="dxa"/>
-              <w:left w:w="120" w:type="dxa"/>
-              <w:right w:w="120" w:type="dxa"/>
-            </w:tcMar>
-            <w:vAlign w:val="center"/>
-          </w:tcPr>
-          <w:p>
-            <w:pPr>
-              <w:spacing w:line="252" w:lineRule="auto" w:before="0" w:after="0"/>
-              <w:jc w:val="left"/>
-            </w:pPr>
-            <w:r>
-              <w:rPr>
-                <w:rFonts w:ascii="Arial" w:hAnsi="Arial"/>
                 <w:color w:val="1E293B"/>
                 <w:sz w:val="18"/>
               </w:rPr>
-              <w:t>1. Usuario con rol autorizado en la delegación.</w:t>
+              <w:t>Wireframe 3: Semáforos y Metas SGR</w:t>
+            </w:r>
+          </w:p>
+        </w:tc>
+        <w:tc>
+          <w:tcPr>
+            <w:tcW w:type="dxa" w:w="3168"/>
+            <w:shd w:fill="F8FAFC"/>
+          </w:tcPr>
+          <w:p>
+            <w:pPr>
+              <w:spacing w:line="264" w:lineRule="auto" w:before="40" w:after="40"/>
+              <w:jc w:val="left"/>
+            </w:pPr>
+            <w:r/>
+            <w:r>
+              <w:rPr>
+                <w:rFonts w:ascii="Consolas" w:hAnsi="Consolas"/>
+                <w:b w:val="0"/>
+                <w:color w:val="0F766E"/>
+                <w:sz w:val="17"/>
+              </w:rPr>
+              <w:t>http://3.229.11.31/resultados/</w:t>
+            </w:r>
+          </w:p>
+        </w:tc>
+        <w:tc>
+          <w:tcPr>
+            <w:tcW w:type="dxa" w:w="1872"/>
+            <w:shd w:fill="F8FAFC"/>
+          </w:tcPr>
+          <w:p>
+            <w:pPr>
+              <w:spacing w:line="264" w:lineRule="auto" w:before="40" w:after="40"/>
+              <w:jc w:val="left"/>
+            </w:pPr>
+            <w:r/>
+            <w:r>
+              <w:rPr>
+                <w:rFonts w:ascii="Arial" w:hAnsi="Arial"/>
+                <w:b w:val="0"/>
+                <w:color w:val="334155"/>
+                <w:sz w:val="18"/>
+              </w:rPr>
+              <w:t>coordinador</w:t>
               <w:br/>
-              <w:t>2. Existencia de compromisos registrados en 'compromisos_tubo'.</w:t>
+              <w:t>pass1234</w:t>
+            </w:r>
+          </w:p>
+        </w:tc>
+        <w:tc>
+          <w:tcPr>
+            <w:tcW w:type="dxa" w:w="2880"/>
+            <w:shd w:fill="F8FAFC"/>
+          </w:tcPr>
+          <w:p>
+            <w:pPr>
+              <w:spacing w:line="264" w:lineRule="auto" w:before="40" w:after="40"/>
+              <w:jc w:val="left"/>
+            </w:pPr>
+            <w:r/>
+            <w:r>
+              <w:rPr>
+                <w:rFonts w:ascii="Arial" w:hAnsi="Arial"/>
+                <w:b w:val="0"/>
+                <w:color w:val="334155"/>
+                <w:sz w:val="18"/>
+              </w:rPr>
+              <w:t>Monitoreo comunal, semáforos tricolor y cálculo de metas ponderadas.</w:t>
             </w:r>
           </w:p>
         </w:tc>
@@ -19406,337 +19797,96 @@
         </w:trPr>
         <w:tc>
           <w:tcPr>
-            <w:tcW w:type="dxa" w:w="4680"/>
-            <w:tcMar>
-              <w:top w:w="80" w:type="dxa"/>
-              <w:bottom w:w="80" w:type="dxa"/>
-              <w:left w:w="120" w:type="dxa"/>
-              <w:right w:w="120" w:type="dxa"/>
-            </w:tcMar>
+            <w:tcW w:type="dxa" w:w="2592"/>
             <w:shd w:fill="FFFFFF"/>
-            <w:tcMar>
-              <w:top w:w="70" w:type="dxa"/>
-              <w:bottom w:w="70" w:type="dxa"/>
-              <w:left w:w="120" w:type="dxa"/>
-              <w:right w:w="120" w:type="dxa"/>
-            </w:tcMar>
-            <w:vAlign w:val="center"/>
-          </w:tcPr>
-          <w:p>
-            <w:pPr>
-              <w:spacing w:line="252" w:lineRule="auto" w:before="0" w:after="0"/>
-              <w:jc w:val="left"/>
-            </w:pPr>
-            <w:r>
-              <w:rPr>
-                <w:rFonts w:ascii="Arial" w:hAnsi="Arial"/>
+          </w:tcPr>
+          <w:p>
+            <w:pPr>
+              <w:spacing w:line="264" w:lineRule="auto" w:before="40" w:after="40"/>
+              <w:jc w:val="left"/>
+            </w:pPr>
+            <w:r/>
+            <w:r>
+              <w:rPr>
+                <w:rFonts w:ascii="Arial" w:hAnsi="Arial"/>
+                <w:b/>
                 <w:color w:val="1E293B"/>
                 <w:sz w:val="18"/>
               </w:rPr>
-              <w:t>Flujo Principal (Exitoso)</w:t>
-            </w:r>
-          </w:p>
-        </w:tc>
-        <w:tc>
-          <w:tcPr>
-            <w:tcW w:type="dxa" w:w="4680"/>
-            <w:tcMar>
-              <w:top w:w="80" w:type="dxa"/>
-              <w:bottom w:w="80" w:type="dxa"/>
-              <w:left w:w="120" w:type="dxa"/>
-              <w:right w:w="120" w:type="dxa"/>
-            </w:tcMar>
+              <w:t>Maqueta Multipantalla Integrada</w:t>
+            </w:r>
+          </w:p>
+        </w:tc>
+        <w:tc>
+          <w:tcPr>
+            <w:tcW w:type="dxa" w:w="3168"/>
             <w:shd w:fill="FFFFFF"/>
-            <w:tcMar>
-              <w:top w:w="70" w:type="dxa"/>
-              <w:bottom w:w="70" w:type="dxa"/>
-              <w:left w:w="120" w:type="dxa"/>
-              <w:right w:w="120" w:type="dxa"/>
-            </w:tcMar>
-            <w:vAlign w:val="center"/>
-          </w:tcPr>
-          <w:p>
-            <w:pPr>
-              <w:spacing w:line="252" w:lineRule="auto" w:before="0" w:after="0"/>
-              <w:jc w:val="left"/>
-            </w:pPr>
-            <w:r>
-              <w:rPr>
-                <w:rFonts w:ascii="Arial" w:hAnsi="Arial"/>
-                <w:color w:val="1E293B"/>
+          </w:tcPr>
+          <w:p>
+            <w:pPr>
+              <w:spacing w:line="264" w:lineRule="auto" w:before="40" w:after="40"/>
+              <w:jc w:val="left"/>
+            </w:pPr>
+            <w:r/>
+            <w:r>
+              <w:rPr>
+                <w:rFonts w:ascii="Consolas" w:hAnsi="Consolas"/>
+                <w:b w:val="0"/>
+                <w:color w:val="0F766E"/>
+                <w:sz w:val="17"/>
+              </w:rPr>
+              <w:t>http://3.229.11.31/wireframes/</w:t>
+            </w:r>
+          </w:p>
+        </w:tc>
+        <w:tc>
+          <w:tcPr>
+            <w:tcW w:type="dxa" w:w="1872"/>
+            <w:shd w:fill="FFFFFF"/>
+          </w:tcPr>
+          <w:p>
+            <w:pPr>
+              <w:spacing w:line="264" w:lineRule="auto" w:before="40" w:after="40"/>
+              <w:jc w:val="left"/>
+            </w:pPr>
+            <w:r/>
+            <w:r>
+              <w:rPr>
+                <w:rFonts w:ascii="Arial" w:hAnsi="Arial"/>
+                <w:b w:val="0"/>
+                <w:color w:val="334155"/>
                 <w:sz w:val="18"/>
               </w:rPr>
-              <w:t>1. El actor ingresa a Tubo de Trabajo (/agenda/resumen/).</w:t>
+              <w:t>Acceso Público</w:t>
               <w:br/>
-              <w:t>2. El sistema consulta la base de datos MySQL por delegación y agrupa los compromisos en 4 columnas según su estado.</w:t>
-              <w:br/>
-              <w:t>3. El sistema renderiza el tablero con conteo en tiempo real por columna.</w:t>
-              <w:br/>
-              <w:t>4. Cada tarjeta expone código TUB-XXXXX, badge con código de gestión de origen [GES/SOC], vecino, territorio y área de apoyo.</w:t>
-              <w:br/>
-              <w:t>5. El actor localiza la tarjeta y presiona el botón de avance (ej: '✓ Realizar').</w:t>
-              <w:br/>
-              <w:t>6. El sistema procesa la transición en el controlador /agenda/cambiar-estado/&lt;id&gt;/REALIZADO/.</w:t>
-              <w:br/>
-              <w:t>7. Se actualiza el compromiso a 'REALIZADO' y automáticamente se actualiza la gestión madre vinculada (Actividad).</w:t>
-              <w:br/>
-              <w:t>8. La tarjeta se traslada a la columna 4 (Realizados) con estilo verde de éxito.</w:t>
-            </w:r>
-          </w:p>
-        </w:tc>
-      </w:tr>
-      <w:tr>
-        <w:trPr>
-          <w:cantSplit/>
-        </w:trPr>
-        <w:tc>
-          <w:tcPr>
-            <w:tcW w:type="dxa" w:w="4680"/>
-            <w:shd w:fill="F8FAFC"/>
-            <w:tcMar>
-              <w:top w:w="80" w:type="dxa"/>
-              <w:bottom w:w="80" w:type="dxa"/>
-              <w:left w:w="120" w:type="dxa"/>
-              <w:right w:w="120" w:type="dxa"/>
-            </w:tcMar>
-            <w:shd w:fill="F8FAFC"/>
-            <w:tcMar>
-              <w:top w:w="70" w:type="dxa"/>
-              <w:bottom w:w="70" w:type="dxa"/>
-              <w:left w:w="120" w:type="dxa"/>
-              <w:right w:w="120" w:type="dxa"/>
-            </w:tcMar>
-            <w:vAlign w:val="center"/>
-          </w:tcPr>
-          <w:p>
-            <w:pPr>
-              <w:spacing w:line="252" w:lineRule="auto" w:before="0" w:after="0"/>
-              <w:jc w:val="left"/>
-            </w:pPr>
-            <w:r>
-              <w:rPr>
-                <w:rFonts w:ascii="Arial" w:hAnsi="Arial"/>
-                <w:color w:val="1E293B"/>
+              <w:t>(Sin login)</w:t>
+            </w:r>
+          </w:p>
+        </w:tc>
+        <w:tc>
+          <w:tcPr>
+            <w:tcW w:type="dxa" w:w="2880"/>
+            <w:shd w:fill="FFFFFF"/>
+          </w:tcPr>
+          <w:p>
+            <w:pPr>
+              <w:spacing w:line="264" w:lineRule="auto" w:before="40" w:after="40"/>
+              <w:jc w:val="left"/>
+            </w:pPr>
+            <w:r/>
+            <w:r>
+              <w:rPr>
+                <w:rFonts w:ascii="Arial" w:hAnsi="Arial"/>
+                <w:b w:val="0"/>
+                <w:color w:val="334155"/>
                 <w:sz w:val="18"/>
               </w:rPr>
-              <w:t>Flujos Alternativos / Excepciones</w:t>
-            </w:r>
-          </w:p>
-        </w:tc>
-        <w:tc>
-          <w:tcPr>
-            <w:tcW w:type="dxa" w:w="4680"/>
-            <w:shd w:fill="F8FAFC"/>
-            <w:tcMar>
-              <w:top w:w="80" w:type="dxa"/>
-              <w:bottom w:w="80" w:type="dxa"/>
-              <w:left w:w="120" w:type="dxa"/>
-              <w:right w:w="120" w:type="dxa"/>
-            </w:tcMar>
-            <w:shd w:fill="F8FAFC"/>
-            <w:tcMar>
-              <w:top w:w="70" w:type="dxa"/>
-              <w:bottom w:w="70" w:type="dxa"/>
-              <w:left w:w="120" w:type="dxa"/>
-              <w:right w:w="120" w:type="dxa"/>
-            </w:tcMar>
-            <w:vAlign w:val="center"/>
-          </w:tcPr>
-          <w:p>
-            <w:pPr>
-              <w:spacing w:line="252" w:lineRule="auto" w:before="0" w:after="0"/>
-              <w:jc w:val="left"/>
-            </w:pPr>
-            <w:r>
-              <w:rPr>
-                <w:rFonts w:ascii="Arial" w:hAnsi="Arial"/>
-                <w:color w:val="1E293B"/>
-                <w:sz w:val="18"/>
-              </w:rPr>
-              <w:t>A1. Compromiso directo sin gestión madre: Opera de manera autónoma sin badge de enlace [GES].</w:t>
-              <w:br/>
-              <w:t>A2. Fallo de permisos: Si un usuario intenta modificar compromisos de otra delegación, el sistema emite HTTP 403 Forbidden.</w:t>
-            </w:r>
-          </w:p>
-        </w:tc>
-      </w:tr>
-      <w:tr>
-        <w:trPr>
-          <w:cantSplit/>
-        </w:trPr>
-        <w:tc>
-          <w:tcPr>
-            <w:tcW w:type="dxa" w:w="4680"/>
-            <w:tcMar>
-              <w:top w:w="80" w:type="dxa"/>
-              <w:bottom w:w="80" w:type="dxa"/>
-              <w:left w:w="120" w:type="dxa"/>
-              <w:right w:w="120" w:type="dxa"/>
-            </w:tcMar>
-            <w:shd w:fill="FFFFFF"/>
-            <w:tcMar>
-              <w:top w:w="70" w:type="dxa"/>
-              <w:bottom w:w="70" w:type="dxa"/>
-              <w:left w:w="120" w:type="dxa"/>
-              <w:right w:w="120" w:type="dxa"/>
-            </w:tcMar>
-            <w:vAlign w:val="center"/>
-          </w:tcPr>
-          <w:p>
-            <w:pPr>
-              <w:spacing w:line="252" w:lineRule="auto" w:before="0" w:after="0"/>
-              <w:jc w:val="left"/>
-            </w:pPr>
-            <w:r>
-              <w:rPr>
-                <w:rFonts w:ascii="Arial" w:hAnsi="Arial"/>
-                <w:b/>
-                <w:color w:val="1E3A8A"/>
-                <w:sz w:val="18"/>
-              </w:rPr>
-              <w:t>Postcondiciones</w:t>
-            </w:r>
-          </w:p>
-        </w:tc>
-        <w:tc>
-          <w:tcPr>
-            <w:tcW w:type="dxa" w:w="4680"/>
-            <w:tcMar>
-              <w:top w:w="80" w:type="dxa"/>
-              <w:bottom w:w="80" w:type="dxa"/>
-              <w:left w:w="120" w:type="dxa"/>
-              <w:right w:w="120" w:type="dxa"/>
-            </w:tcMar>
-            <w:shd w:fill="FFFFFF"/>
-            <w:tcMar>
-              <w:top w:w="70" w:type="dxa"/>
-              <w:bottom w:w="70" w:type="dxa"/>
-              <w:left w:w="120" w:type="dxa"/>
-              <w:right w:w="120" w:type="dxa"/>
-            </w:tcMar>
-            <w:vAlign w:val="center"/>
-          </w:tcPr>
-          <w:p>
-            <w:pPr>
-              <w:spacing w:line="252" w:lineRule="auto" w:before="0" w:after="0"/>
-              <w:jc w:val="left"/>
-            </w:pPr>
-            <w:r>
-              <w:rPr>
-                <w:rFonts w:ascii="Arial" w:hAnsi="Arial"/>
-                <w:color w:val="1E293B"/>
-                <w:sz w:val="18"/>
-              </w:rPr>
-              <w:t>El compromiso se marca como cumplido y suma para las metas ponderadas en el módulo de Resultados SGR.</w:t>
+              <w:t>Lienzo interactivo HTML con selector de vistas y componentes interactivos.</w:t>
             </w:r>
           </w:p>
         </w:tc>
       </w:tr>
     </w:tbl>
-    <w:p>
-      <w:pPr>
-        <w:spacing w:line="240" w:lineRule="auto" w:before="80" w:after="160"/>
-        <w:jc w:val="left"/>
-      </w:pPr>
-      <w:r>
-        <w:rPr>
-          <w:rFonts w:ascii="Consolas" w:hAnsi="Consolas"/>
-          <w:color w:val="1E293B"/>
-          <w:sz w:val="15"/>
-        </w:rPr>
-        <w:t>┌─────────────────────────────────────────────────────────────────────────────────────────────┐</w:t>
-        <w:br/>
-        <w:t>│ MUNICIPALIDAD DE LA SERENA — SGR                👤 Carlos Delegado [Las Compañías]  [Salir] │</w:t>
-        <w:br/>
-        <w:t>├─────────────────────────────────────────────────────────────────────────────────────────────┤</w:t>
-        <w:br/>
-        <w:t>│ TABLERO KANBAN — MÉTODO TUBO DE TRABAJO (RF-017 / CU-02.1)           [ + Nuevo Compromiso ] │</w:t>
-        <w:br/>
-        <w:t>├────────────────────────┬────────────────────────┬─────────────────────┬─────────────────────┤</w:t>
-        <w:br/>
-        <w:t>│ 1. INGRESADOS      (2) │ 2. PENDIENTES      (1) │ 3. EN PROCESO   (2) │ 4. REALIZADOS   (3) │</w:t>
-        <w:br/>
-        <w:t>├────────────────────────┼────────────────────────┼─────────────────────┼─────────────────────┤</w:t>
-        <w:br/>
-        <w:t>│ ┌────────────────────┐ │ ┌────────────────────┐ │ ┌─────────────────┐ │ ┌─────────────────┐ │</w:t>
-        <w:br/>
-        <w:t>│ │ TUB-00028          │ │ │ TUB-00025          │ │ │ TUB-00024       │ │ │ TUB-00019       │ │</w:t>
-        <w:br/>
-        <w:t>│ │ [GES-00028] (Link) │ │ │ [GES-00025] (Link) │ │ │ [SOC-00027]     │ │ │ [SOC-00022]     │ │</w:t>
-        <w:br/>
-        <w:t>│ │ Socavón calzada en │ │ │ Luminarias pasaje  │ │ │ Evaluación y    │ │ │ Techumbre en    │ │</w:t>
-        <w:br/>
-        <w:t>│ │ Pasaje Las Rosas   │ │ │ Los Lirios #45     │ │ │ canasta social  │ │ │ sector El Romero│ │</w:t>
-        <w:br/>
-        <w:t>│ │ 👤 R. Valenzuela   │ │ │ 👤 M. Henríquez    │ │ │ 👤 B. Ossa M.   │ │ │ 👤 G. Cortés    │ │</w:t>
-        <w:br/>
-        <w:t>│ │ 📍 El Salitre      │ │ │ 📍 Sector Las Rosas│ │ │ 📍 El Romero    │ │ │ 📍 M. Brillador │ │</w:t>
-        <w:br/>
-        <w:t>│ │ 🛠️ Obras y Tránsito│ │ │ 🛠️ Alumbrado Públ. │ │ │ 🛠️ DIDECO Social│ │ │ 🛠️ Emergencia   │ │</w:t>
-        <w:br/>
-        <w:t>│ │ [Ver] [A Pendiente]│ │ │ [Ver] [A Proceso →]│ │ │ [Ver][✓Realizar]│ │ │ [Ver] (Cerrada) │ │</w:t>
-        <w:br/>
-        <w:t>│ └────────────────────┘ │ └────────────────────┘ │ └─────────────────┘ │ └─────────────────┘ │</w:t>
-        <w:br/>
-        <w:t>└────────────────────────┴────────────────────────┴─────────────────────┴─────────────────────┘</w:t>
-      </w:r>
-    </w:p>
-    <w:p>
-      <w:pPr>
-        <w:pStyle w:val="Heading3"/>
-        <w:spacing w:before="200" w:after="60"/>
-        <w:jc w:val="left"/>
-      </w:pPr>
-      <w:r>
-        <w:rPr>
-          <w:rFonts w:ascii="Arial" w:hAnsi="Arial"/>
-          <w:b/>
-          <w:color w:val="334155"/>
-          <w:sz w:val="22"/>
-        </w:rPr>
-        <w:t>3.7.3 Evidencia de Despliegue y Acceso a los Prototipos en Producción</w:t>
-      </w:r>
-    </w:p>
-    <w:p>
-      <w:pPr>
-        <w:spacing w:line="276" w:lineRule="auto" w:before="0" w:after="120"/>
-        <w:jc w:val="both"/>
-      </w:pPr>
-      <w:r>
-        <w:rPr>
-          <w:rFonts w:ascii="Arial" w:hAnsi="Arial"/>
-          <w:color w:val="1E293B"/>
-          <w:sz w:val="22"/>
-        </w:rPr>
-        <w:t>Para facilitar la revisión y evaluación interactiva por parte de la docente guía, los wireframes y el prototipo funcional completo se encuentran desplegados y operativos en la nube pública:</w:t>
-        <w:br/>
-        <w:br/>
-        <w:t>• Wireframe Interactivo en Línea (Blueprint Dinámico):</w:t>
-        <w:br/>
-        <w:t xml:space="preserve">  URL: http://3.229.11.31/wireframes/</w:t>
-        <w:br/>
-        <w:t xml:space="preserve">  Permite al evaluador alternar entre el Formulario Unificado y el Tablero Kanban, accionar el switch interactivo del Tubo de Trabajo y verificar la carga asíncrona de subatenciones en cascada.</w:t>
-        <w:br/>
-        <w:br/>
-        <w:t>• Prototipo Funcional Real en Producción (AWS EC2):</w:t>
-        <w:br/>
-        <w:t xml:space="preserve">  - Formulario Unificado de Gestiones: http://3.229.11.31/actividades/nueva/</w:t>
-        <w:br/>
-        <w:t xml:space="preserve">  - Tablero Kanban del Tubo de Trabajo: http://3.229.11.31/agenda/resumen/</w:t>
-        <w:br/>
-        <w:t xml:space="preserve">  - Libro General de Gestiones: http://3.229.11.31/actividades/</w:t>
-        <w:br/>
-        <w:t xml:space="preserve">  - Acceso Principal a la Plataforma: http://3.229.11.31/login/</w:t>
-      </w:r>
-    </w:p>
-    <w:sectPr>
-      <w:headerReference w:type="default" r:id="rId9"/>
-      <w:footerReference w:type="default" r:id="rId10"/>
-      <w:pgSz w:w="12240" w:h="15840"/>
-      <w:pgMar w:top="1440" w:right="1440" w:bottom="1440" w:left="1440" w:header="720" w:footer="720" w:gutter="0"/>
-      <w:cols w:space="720"/>
-      <w:docGrid w:linePitch="360"/>
-    </w:sectPr>
   </w:body>
 </w:document>
 </file>

</xml_diff>